<commit_message>
Release 1.0.4: goods category by name, English by default [release]
The pilot release 1.0.4: the goods category shows its catalogue name on the terms screen and
print, the screens start in English (Arabic the second choice, kept once chosen), and prints
and e-mails are in English unless the user's language is Arabic. No database change.
The images job, which publishes a release, now waits for the database job, so a release is
published only after app_ci.sh and its integration tests have passed on the same commit.

Co-Authored-By: Claude Opus 5.5 <noreply@anthropic.com>
Claude-Session: https://claude.ai/code/session_012HHcRrzuvMBTL2FYxXtsyv
</commit_message>
<xml_diff>
--- a/treasury-platform/docs/57-RELEASE.docx
+++ b/treasury-platform/docs/57-RELEASE.docx
@@ -17,7 +17,7 @@
           <w:szCs w:val="48"/>
           <w:rtl/>
         </w:rPr>
-        <w:t xml:space="preserve">إصدارات التشغيل التجريبي، والإصدار الحالي 1.0.3 (الصفوف 60 و62 و66 و68 في </w:t>
+        <w:t xml:space="preserve">إصدارات التشغيل التجريبي، والإصدار الحالي 1.0.4 (الصفوف 60 و62 و66 و68 و69 في </w:t>
       </w:r>
       <w:r>
         <w:rPr>
@@ -167,6 +167,28 @@
           <w:rtl/>
         </w:rPr>
         <w:t xml:space="preserve">الإصدار 1.0.3: «نعم طبقه على المطبوع وأصدر 1.0.3».</w:t>
+      </w:r>
+    </w:p>
+    <w:p>
+      <w:pPr>
+        <w:pStyle w:val="ListParagraph"/>
+        <w:numPr>
+          <w:ilvl w:val="0"/>
+          <w:numId w:val="2"/>
+        </w:numPr>
+        <w:bidi/>
+        <w:spacing w:after="70" w:before="0" w:line="300"/>
+      </w:pPr>
+      <w:r>
+        <w:rPr>
+          <w:rFonts w:ascii="Arial" w:cs="Arial" w:eastAsia="Arial" w:hAnsi="Arial"/>
+          <w:b w:val="false"/>
+          <w:bCs w:val="false"/>
+          <w:sz w:val="21"/>
+          <w:szCs w:val="21"/>
+          <w:rtl/>
+        </w:rPr>
+        <w:t xml:space="preserve">الإصدار 1.0.4: «نعم أصدر 1.0.4».</w:t>
       </w:r>
     </w:p>
     <w:p>
@@ -369,7 +391,7 @@
                 <w:szCs w:val="18"/>
                 <w:rtl/>
               </w:rPr>
-              <w:t xml:space="preserve">1.0.3</w:t>
+              <w:t xml:space="preserve">1.0.4</w:t>
             </w:r>
           </w:p>
         </w:tc>
@@ -441,7 +463,7 @@
                 <w:szCs w:val="18"/>
                 <w:rtl/>
               </w:rPr>
-              <w:t xml:space="preserve">شروط الاعتماد برمز حقل سويفت MT700 بدل مراجع UCP في الشاشة والمطبوع، والقيم بالعربية، وكل حقول MT700 في القاموس، منها 47A و44A و44B و40A و58a. ولا أيام تأجيل لاعتماد الاطلاع (</w:t>
+              <w:t xml:space="preserve">تصنيف البضاعة باسمه من الكتالوج في الشاشة والمطبوع، والإنجليزية لغة افتراضية للشاشات والمطبوعات والبريد، والعربية خيار يحفظه المستخدم (</w:t>
             </w:r>
             <w:r>
               <w:rPr>
@@ -465,7 +487,7 @@
                 <w:szCs w:val="18"/>
                 <w:rtl/>
               </w:rPr>
-              <w:t xml:space="preserve"> §6 و§7)</w:t>
+              <w:t xml:space="preserve"> §8)</w:t>
             </w:r>
           </w:p>
         </w:tc>
@@ -507,7 +529,7 @@
                 <w:szCs w:val="18"/>
                 <w:rtl/>
               </w:rPr>
-              <w:t xml:space="preserve">1.0.2</w:t>
+              <w:t xml:space="preserve">1.0.3</w:t>
             </w:r>
           </w:p>
         </w:tc>
@@ -581,7 +603,7 @@
                 <w:szCs w:val="18"/>
                 <w:rtl/>
               </w:rPr>
-              <w:t xml:space="preserve">مراجع UCP 600 بجانب حقول شروط الاعتماد ومستنداته، وفحوص المواد 28 و29 و31-32 و19-24 (</w:t>
+              <w:t xml:space="preserve">شروط الاعتماد برمز حقل سويفت MT700 بدل مراجع UCP في الشاشة والمطبوع، والقيم بالعربية، وكل حقول MT700 في القاموس، منها 47A و44A و44B و40A و58a. ولا أيام تأجيل لاعتماد الاطلاع (</w:t>
             </w:r>
             <w:r>
               <w:rPr>
@@ -605,116 +627,7 @@
                 <w:szCs w:val="18"/>
                 <w:rtl/>
               </w:rPr>
-              <w:t xml:space="preserve">). ودعم الخادم الواحد للتجربة (</w:t>
-            </w:r>
-            <w:r>
-              <w:rPr>
-                <w:rFonts w:ascii="Courier New" w:cs="Courier New" w:eastAsia="Courier New" w:hAnsi="Courier New"/>
-                <w:b w:val="false"/>
-                <w:bCs w:val="false"/>
-                <w:color w:val="1F2937"/>
-                <w:sz w:val="16"/>
-                <w:szCs w:val="16"/>
-                <w:shd w:fill="F1F3F5" w:color="auto" w:val="clear"/>
-                <w:rtl/>
-              </w:rPr>
-              <w:t xml:space="preserve">‎docs/58‎</w:t>
-            </w:r>
-            <w:r>
-              <w:rPr>
-                <w:rFonts w:ascii="Arial" w:cs="Arial" w:eastAsia="Arial" w:hAnsi="Arial"/>
-                <w:b w:val="false"/>
-                <w:bCs w:val="false"/>
-                <w:sz w:val="18"/>
-                <w:szCs w:val="18"/>
-                <w:rtl/>
-              </w:rPr>
-              <w:t xml:space="preserve">): </w:t>
-            </w:r>
-            <w:r>
-              <w:rPr>
-                <w:rFonts w:ascii="Courier New" w:cs="Courier New" w:eastAsia="Courier New" w:hAnsi="Courier New"/>
-                <w:b w:val="false"/>
-                <w:bCs w:val="false"/>
-                <w:color w:val="1F2937"/>
-                <w:sz w:val="16"/>
-                <w:szCs w:val="16"/>
-                <w:shd w:fill="F1F3F5" w:color="auto" w:val="clear"/>
-                <w:rtl/>
-              </w:rPr>
-              <w:t xml:space="preserve">‎DB_ADDRESS‎</w:t>
-            </w:r>
-            <w:r>
-              <w:rPr>
-                <w:rFonts w:ascii="Arial" w:cs="Arial" w:eastAsia="Arial" w:hAnsi="Arial"/>
-                <w:b w:val="false"/>
-                <w:bCs w:val="false"/>
-                <w:sz w:val="18"/>
-                <w:szCs w:val="18"/>
-                <w:rtl/>
-              </w:rPr>
-              <w:t xml:space="preserve"> في </w:t>
-            </w:r>
-            <w:r>
-              <w:rPr>
-                <w:rFonts w:ascii="Courier New" w:cs="Courier New" w:eastAsia="Courier New" w:hAnsi="Courier New"/>
-                <w:b w:val="false"/>
-                <w:bCs w:val="false"/>
-                <w:color w:val="1F2937"/>
-                <w:sz w:val="16"/>
-                <w:szCs w:val="16"/>
-                <w:shd w:fill="F1F3F5" w:color="auto" w:val="clear"/>
-                <w:rtl/>
-              </w:rPr>
-              <w:t xml:space="preserve">‎site.conf‎</w:t>
-            </w:r>
-            <w:r>
-              <w:rPr>
-                <w:rFonts w:ascii="Arial" w:cs="Arial" w:eastAsia="Arial" w:hAnsi="Arial"/>
-                <w:b w:val="false"/>
-                <w:bCs w:val="false"/>
-                <w:sz w:val="18"/>
-                <w:szCs w:val="18"/>
-                <w:rtl/>
-              </w:rPr>
-              <w:t xml:space="preserve">، و</w:t>
-            </w:r>
-            <w:r>
-              <w:rPr>
-                <w:rFonts w:ascii="Courier New" w:cs="Courier New" w:eastAsia="Courier New" w:hAnsi="Courier New"/>
-                <w:b w:val="false"/>
-                <w:bCs w:val="false"/>
-                <w:color w:val="1F2937"/>
-                <w:sz w:val="16"/>
-                <w:szCs w:val="16"/>
-                <w:shd w:fill="F1F3F5" w:color="auto" w:val="clear"/>
-                <w:rtl/>
-              </w:rPr>
-              <w:t xml:space="preserve">‎DB_ON_THIS_HOST=1‎</w:t>
-            </w:r>
-            <w:r>
-              <w:rPr>
-                <w:rFonts w:ascii="Arial" w:cs="Arial" w:eastAsia="Arial" w:hAnsi="Arial"/>
-                <w:b w:val="false"/>
-                <w:bCs w:val="false"/>
-                <w:sz w:val="18"/>
-                <w:szCs w:val="18"/>
-                <w:rtl/>
-              </w:rPr>
-              <w:t xml:space="preserve"> في </w:t>
-            </w:r>
-            <w:r>
-              <w:rPr>
-                <w:rFonts w:ascii="Courier New" w:cs="Courier New" w:eastAsia="Courier New" w:hAnsi="Courier New"/>
-                <w:b w:val="false"/>
-                <w:bCs w:val="false"/>
-                <w:color w:val="1F2937"/>
-                <w:sz w:val="16"/>
-                <w:szCs w:val="16"/>
-                <w:shd w:fill="F1F3F5" w:color="auto" w:val="clear"/>
-                <w:rtl/>
-              </w:rPr>
-              <w:t xml:space="preserve">‎ufw.sh‎</w:t>
+              <w:t xml:space="preserve"> §6 و§7)</w:t>
             </w:r>
           </w:p>
         </w:tc>
@@ -755,7 +668,7 @@
                 <w:szCs w:val="18"/>
                 <w:rtl/>
               </w:rPr>
-              <w:t xml:space="preserve">1.0.1</w:t>
+              <w:t xml:space="preserve">1.0.2</w:t>
             </w:r>
           </w:p>
         </w:tc>
@@ -791,7 +704,7 @@
                 <w:szCs w:val="18"/>
                 <w:rtl/>
               </w:rPr>
-              <w:t xml:space="preserve">2026-10-25</w:t>
+              <w:t xml:space="preserve">2026-10-26</w:t>
             </w:r>
           </w:p>
         </w:tc>
@@ -827,7 +740,7 @@
                 <w:szCs w:val="18"/>
                 <w:rtl/>
               </w:rPr>
-              <w:t xml:space="preserve">تقرير التقييم الائتماني المطبوع بغلافه وصفحاته الداخلية على الهوية (</w:t>
+              <w:t xml:space="preserve">مراجع UCP 600 بجانب حقول شروط الاعتماد ومستنداته، وفحوص المواد 28 و29 و31-32 و19-24 (</w:t>
             </w:r>
             <w:r>
               <w:rPr>
@@ -840,18 +753,127 @@
                 <w:shd w:fill="F1F3F5" w:color="auto" w:val="clear"/>
                 <w:rtl/>
               </w:rPr>
-              <w:t xml:space="preserve">‎docs/56‎</w:t>
-            </w:r>
-            <w:r>
-              <w:rPr>
-                <w:rFonts w:ascii="Arial" w:cs="Arial" w:eastAsia="Arial" w:hAnsi="Arial"/>
-                <w:b w:val="false"/>
-                <w:bCs w:val="false"/>
-                <w:sz w:val="18"/>
-                <w:szCs w:val="18"/>
-                <w:rtl/>
-              </w:rPr>
-              <w:t xml:space="preserve"> §7)، برابطي «طباعة التقرير» و«تنزيل PDF» في شاشة التقييم. ودليل التثبيت صار جزءًا من كل إصدار باسم ثابت</w:t>
+              <w:t xml:space="preserve">‎docs/60‎</w:t>
+            </w:r>
+            <w:r>
+              <w:rPr>
+                <w:rFonts w:ascii="Arial" w:cs="Arial" w:eastAsia="Arial" w:hAnsi="Arial"/>
+                <w:b w:val="false"/>
+                <w:bCs w:val="false"/>
+                <w:sz w:val="18"/>
+                <w:szCs w:val="18"/>
+                <w:rtl/>
+              </w:rPr>
+              <w:t xml:space="preserve">). ودعم الخادم الواحد للتجربة (</w:t>
+            </w:r>
+            <w:r>
+              <w:rPr>
+                <w:rFonts w:ascii="Courier New" w:cs="Courier New" w:eastAsia="Courier New" w:hAnsi="Courier New"/>
+                <w:b w:val="false"/>
+                <w:bCs w:val="false"/>
+                <w:color w:val="1F2937"/>
+                <w:sz w:val="16"/>
+                <w:szCs w:val="16"/>
+                <w:shd w:fill="F1F3F5" w:color="auto" w:val="clear"/>
+                <w:rtl/>
+              </w:rPr>
+              <w:t xml:space="preserve">‎docs/58‎</w:t>
+            </w:r>
+            <w:r>
+              <w:rPr>
+                <w:rFonts w:ascii="Arial" w:cs="Arial" w:eastAsia="Arial" w:hAnsi="Arial"/>
+                <w:b w:val="false"/>
+                <w:bCs w:val="false"/>
+                <w:sz w:val="18"/>
+                <w:szCs w:val="18"/>
+                <w:rtl/>
+              </w:rPr>
+              <w:t xml:space="preserve">): </w:t>
+            </w:r>
+            <w:r>
+              <w:rPr>
+                <w:rFonts w:ascii="Courier New" w:cs="Courier New" w:eastAsia="Courier New" w:hAnsi="Courier New"/>
+                <w:b w:val="false"/>
+                <w:bCs w:val="false"/>
+                <w:color w:val="1F2937"/>
+                <w:sz w:val="16"/>
+                <w:szCs w:val="16"/>
+                <w:shd w:fill="F1F3F5" w:color="auto" w:val="clear"/>
+                <w:rtl/>
+              </w:rPr>
+              <w:t xml:space="preserve">‎DB_ADDRESS‎</w:t>
+            </w:r>
+            <w:r>
+              <w:rPr>
+                <w:rFonts w:ascii="Arial" w:cs="Arial" w:eastAsia="Arial" w:hAnsi="Arial"/>
+                <w:b w:val="false"/>
+                <w:bCs w:val="false"/>
+                <w:sz w:val="18"/>
+                <w:szCs w:val="18"/>
+                <w:rtl/>
+              </w:rPr>
+              <w:t xml:space="preserve"> في </w:t>
+            </w:r>
+            <w:r>
+              <w:rPr>
+                <w:rFonts w:ascii="Courier New" w:cs="Courier New" w:eastAsia="Courier New" w:hAnsi="Courier New"/>
+                <w:b w:val="false"/>
+                <w:bCs w:val="false"/>
+                <w:color w:val="1F2937"/>
+                <w:sz w:val="16"/>
+                <w:szCs w:val="16"/>
+                <w:shd w:fill="F1F3F5" w:color="auto" w:val="clear"/>
+                <w:rtl/>
+              </w:rPr>
+              <w:t xml:space="preserve">‎site.conf‎</w:t>
+            </w:r>
+            <w:r>
+              <w:rPr>
+                <w:rFonts w:ascii="Arial" w:cs="Arial" w:eastAsia="Arial" w:hAnsi="Arial"/>
+                <w:b w:val="false"/>
+                <w:bCs w:val="false"/>
+                <w:sz w:val="18"/>
+                <w:szCs w:val="18"/>
+                <w:rtl/>
+              </w:rPr>
+              <w:t xml:space="preserve">، و</w:t>
+            </w:r>
+            <w:r>
+              <w:rPr>
+                <w:rFonts w:ascii="Courier New" w:cs="Courier New" w:eastAsia="Courier New" w:hAnsi="Courier New"/>
+                <w:b w:val="false"/>
+                <w:bCs w:val="false"/>
+                <w:color w:val="1F2937"/>
+                <w:sz w:val="16"/>
+                <w:szCs w:val="16"/>
+                <w:shd w:fill="F1F3F5" w:color="auto" w:val="clear"/>
+                <w:rtl/>
+              </w:rPr>
+              <w:t xml:space="preserve">‎DB_ON_THIS_HOST=1‎</w:t>
+            </w:r>
+            <w:r>
+              <w:rPr>
+                <w:rFonts w:ascii="Arial" w:cs="Arial" w:eastAsia="Arial" w:hAnsi="Arial"/>
+                <w:b w:val="false"/>
+                <w:bCs w:val="false"/>
+                <w:sz w:val="18"/>
+                <w:szCs w:val="18"/>
+                <w:rtl/>
+              </w:rPr>
+              <w:t xml:space="preserve"> في </w:t>
+            </w:r>
+            <w:r>
+              <w:rPr>
+                <w:rFonts w:ascii="Courier New" w:cs="Courier New" w:eastAsia="Courier New" w:hAnsi="Courier New"/>
+                <w:b w:val="false"/>
+                <w:bCs w:val="false"/>
+                <w:color w:val="1F2937"/>
+                <w:sz w:val="16"/>
+                <w:szCs w:val="16"/>
+                <w:shd w:fill="F1F3F5" w:color="auto" w:val="clear"/>
+                <w:rtl/>
+              </w:rPr>
+              <w:t xml:space="preserve">‎ufw.sh‎</w:t>
             </w:r>
           </w:p>
         </w:tc>
@@ -893,6 +915,145 @@
                 <w:szCs w:val="18"/>
                 <w:rtl/>
               </w:rPr>
+              <w:t xml:space="preserve">1.0.1</w:t>
+            </w:r>
+          </w:p>
+        </w:tc>
+        <w:tc>
+          <w:tcPr>
+            <w:tcW w:type="dxa" w:w="2818"/>
+            <w:tcBorders>
+              <w:top w:val="single" w:color="BFC9D6" w:sz="4"/>
+              <w:left w:val="single" w:color="BFC9D6" w:sz="4"/>
+              <w:bottom w:val="single" w:color="BFC9D6" w:sz="4"/>
+              <w:right w:val="single" w:color="BFC9D6" w:sz="4"/>
+            </w:tcBorders>
+            <w:shd w:fill="F5F8FC" w:color="auto" w:val="clear"/>
+            <w:tcMar>
+              <w:top w:type="dxa" w:w="50"/>
+              <w:left w:type="dxa" w:w="90"/>
+              <w:bottom w:type="dxa" w:w="50"/>
+              <w:right w:type="dxa" w:w="90"/>
+            </w:tcMar>
+            <w:vAlign w:val="top"/>
+          </w:tcPr>
+          <w:p>
+            <w:pPr>
+              <w:keepNext w:val="false"/>
+              <w:bidi/>
+              <w:spacing w:after="30" w:before="30" w:line="264"/>
+            </w:pPr>
+            <w:r>
+              <w:rPr>
+                <w:rFonts w:ascii="Arial" w:cs="Arial" w:eastAsia="Arial" w:hAnsi="Arial"/>
+                <w:b w:val="false"/>
+                <w:bCs w:val="false"/>
+                <w:sz w:val="18"/>
+                <w:szCs w:val="18"/>
+                <w:rtl/>
+              </w:rPr>
+              <w:t xml:space="preserve">2026-10-25</w:t>
+            </w:r>
+          </w:p>
+        </w:tc>
+        <w:tc>
+          <w:tcPr>
+            <w:tcW w:type="dxa" w:w="5074"/>
+            <w:tcBorders>
+              <w:top w:val="single" w:color="BFC9D6" w:sz="4"/>
+              <w:left w:val="single" w:color="BFC9D6" w:sz="4"/>
+              <w:bottom w:val="single" w:color="BFC9D6" w:sz="4"/>
+              <w:right w:val="single" w:color="BFC9D6" w:sz="4"/>
+            </w:tcBorders>
+            <w:shd w:fill="F5F8FC" w:color="auto" w:val="clear"/>
+            <w:tcMar>
+              <w:top w:type="dxa" w:w="50"/>
+              <w:left w:type="dxa" w:w="90"/>
+              <w:bottom w:type="dxa" w:w="50"/>
+              <w:right w:type="dxa" w:w="90"/>
+            </w:tcMar>
+            <w:vAlign w:val="top"/>
+          </w:tcPr>
+          <w:p>
+            <w:pPr>
+              <w:keepNext w:val="false"/>
+              <w:bidi/>
+              <w:spacing w:after="30" w:before="30" w:line="264"/>
+            </w:pPr>
+            <w:r>
+              <w:rPr>
+                <w:rFonts w:ascii="Arial" w:cs="Arial" w:eastAsia="Arial" w:hAnsi="Arial"/>
+                <w:b w:val="false"/>
+                <w:bCs w:val="false"/>
+                <w:sz w:val="18"/>
+                <w:szCs w:val="18"/>
+                <w:rtl/>
+              </w:rPr>
+              <w:t xml:space="preserve">تقرير التقييم الائتماني المطبوع بغلافه وصفحاته الداخلية على الهوية (</w:t>
+            </w:r>
+            <w:r>
+              <w:rPr>
+                <w:rFonts w:ascii="Courier New" w:cs="Courier New" w:eastAsia="Courier New" w:hAnsi="Courier New"/>
+                <w:b w:val="false"/>
+                <w:bCs w:val="false"/>
+                <w:color w:val="1F2937"/>
+                <w:sz w:val="16"/>
+                <w:szCs w:val="16"/>
+                <w:shd w:fill="F1F3F5" w:color="auto" w:val="clear"/>
+                <w:rtl/>
+              </w:rPr>
+              <w:t xml:space="preserve">‎docs/56‎</w:t>
+            </w:r>
+            <w:r>
+              <w:rPr>
+                <w:rFonts w:ascii="Arial" w:cs="Arial" w:eastAsia="Arial" w:hAnsi="Arial"/>
+                <w:b w:val="false"/>
+                <w:bCs w:val="false"/>
+                <w:sz w:val="18"/>
+                <w:szCs w:val="18"/>
+                <w:rtl/>
+              </w:rPr>
+              <w:t xml:space="preserve"> §7)، برابطي «طباعة التقرير» و«تنزيل PDF» في شاشة التقييم. ودليل التثبيت صار جزءًا من كل إصدار باسم ثابت</w:t>
+            </w:r>
+          </w:p>
+        </w:tc>
+      </w:tr>
+      <w:tr>
+        <w:trPr>
+          <w:cantSplit/>
+        </w:trPr>
+        <w:tc>
+          <w:tcPr>
+            <w:tcW w:type="dxa" w:w="1972"/>
+            <w:tcBorders>
+              <w:top w:val="single" w:color="BFC9D6" w:sz="4"/>
+              <w:left w:val="single" w:color="BFC9D6" w:sz="4"/>
+              <w:bottom w:val="single" w:color="BFC9D6" w:sz="4"/>
+              <w:right w:val="single" w:color="BFC9D6" w:sz="4"/>
+            </w:tcBorders>
+            <w:tcMar>
+              <w:top w:type="dxa" w:w="50"/>
+              <w:left w:type="dxa" w:w="90"/>
+              <w:bottom w:type="dxa" w:w="50"/>
+              <w:right w:type="dxa" w:w="90"/>
+            </w:tcMar>
+            <w:vAlign w:val="top"/>
+          </w:tcPr>
+          <w:p>
+            <w:pPr>
+              <w:keepNext w:val="false"/>
+              <w:bidi/>
+              <w:spacing w:after="30" w:before="30" w:line="264"/>
+            </w:pPr>
+            <w:r>
+              <w:rPr>
+                <w:rFonts w:ascii="Arial" w:cs="Arial" w:eastAsia="Arial" w:hAnsi="Arial"/>
+                <w:b w:val="false"/>
+                <w:bCs w:val="false"/>
+                <w:sz w:val="18"/>
+                <w:szCs w:val="18"/>
+                <w:rtl/>
+              </w:rPr>
               <w:t xml:space="preserve">1.0.0</w:t>
             </w:r>
           </w:p>
@@ -906,7 +1067,6 @@
               <w:bottom w:val="single" w:color="BFC9D6" w:sz="4"/>
               <w:right w:val="single" w:color="BFC9D6" w:sz="4"/>
             </w:tcBorders>
-            <w:shd w:fill="F5F8FC" w:color="auto" w:val="clear"/>
             <w:tcMar>
               <w:top w:type="dxa" w:w="50"/>
               <w:left w:type="dxa" w:w="90"/>
@@ -943,7 +1103,6 @@
               <w:bottom w:val="single" w:color="BFC9D6" w:sz="4"/>
               <w:right w:val="single" w:color="BFC9D6" w:sz="4"/>
             </w:tcBorders>
-            <w:shd w:fill="F5F8FC" w:color="auto" w:val="clear"/>
             <w:tcMar>
               <w:top w:type="dxa" w:w="50"/>
               <w:left w:type="dxa" w:w="90"/>
@@ -1150,6 +1309,82 @@
     <w:p>
       <w:r>
         <w:br w:type="page"/>
+      </w:r>
+    </w:p>
+    <w:p>
+      <w:pPr>
+        <w:bidi/>
+        <w:spacing w:after="110" w:before="0" w:line="312"/>
+      </w:pPr>
+      <w:r>
+        <w:rPr>
+          <w:rFonts w:ascii="Arial" w:cs="Arial" w:eastAsia="Arial" w:hAnsi="Arial"/>
+          <w:b/>
+          <w:bCs/>
+          <w:sz w:val="21"/>
+          <w:szCs w:val="21"/>
+          <w:rtl/>
+        </w:rPr>
+        <w:t xml:space="preserve">الترقية من 1.0.3 إلى 1.0.4:</w:t>
+      </w:r>
+      <w:r>
+        <w:rPr>
+          <w:rFonts w:ascii="Arial" w:cs="Arial" w:eastAsia="Arial" w:hAnsi="Arial"/>
+          <w:b w:val="false"/>
+          <w:bCs w:val="false"/>
+          <w:sz w:val="21"/>
+          <w:szCs w:val="21"/>
+          <w:rtl/>
+        </w:rPr>
+        <w:t xml:space="preserve"> لا تغيير في قاعدة البيانات. تُحمَّل الصورتان الجديدتان، ثم يُغيَّر رقم الإصدار في </w:t>
+      </w:r>
+      <w:r>
+        <w:rPr>
+          <w:rFonts w:ascii="Courier New" w:cs="Courier New" w:eastAsia="Courier New" w:hAnsi="Courier New"/>
+          <w:b w:val="false"/>
+          <w:bCs w:val="false"/>
+          <w:color w:val="1F2937"/>
+          <w:sz w:val="18"/>
+          <w:szCs w:val="18"/>
+          <w:shd w:fill="F1F3F5" w:color="auto" w:val="clear"/>
+          <w:rtl/>
+        </w:rPr>
+        <w:t xml:space="preserve">‎compose.yml‎</w:t>
+      </w:r>
+      <w:r>
+        <w:rPr>
+          <w:rFonts w:ascii="Arial" w:cs="Arial" w:eastAsia="Arial" w:hAnsi="Arial"/>
+          <w:b w:val="false"/>
+          <w:bCs w:val="false"/>
+          <w:sz w:val="21"/>
+          <w:szCs w:val="21"/>
+          <w:rtl/>
+        </w:rPr>
+        <w:t xml:space="preserve">، ثم </w:t>
+      </w:r>
+      <w:r>
+        <w:rPr>
+          <w:rFonts w:ascii="Courier New" w:cs="Courier New" w:eastAsia="Courier New" w:hAnsi="Courier New"/>
+          <w:b w:val="false"/>
+          <w:bCs w:val="false"/>
+          <w:color w:val="1F2937"/>
+          <w:sz w:val="18"/>
+          <w:szCs w:val="18"/>
+          <w:shd w:fill="F1F3F5" w:color="auto" w:val="clear"/>
+          <w:rtl/>
+        </w:rPr>
+        <w:t xml:space="preserve">‎sudo docker compose up -d‎</w:t>
+      </w:r>
+      <w:r>
+        <w:rPr>
+          <w:rFonts w:ascii="Arial" w:cs="Arial" w:eastAsia="Arial" w:hAnsi="Arial"/>
+          <w:b w:val="false"/>
+          <w:bCs w:val="false"/>
+          <w:sz w:val="21"/>
+          <w:szCs w:val="21"/>
+          <w:rtl/>
+        </w:rPr>
+        <w:t xml:space="preserve">. والمستخدم الذي كان يرى العربية لأن متصفحه بالعربية يرى الإنجليزية أول مرة، ويختار العربية من زر اللغة.</w:t>
       </w:r>
     </w:p>
     <w:p>
@@ -2201,7 +2436,7 @@
           <w:shd w:fill="F1F3F5" w:color="auto" w:val="clear"/>
           <w:rtl/>
         </w:rPr>
-        <w:t xml:space="preserve">‎bankfas-v1.0.3‎</w:t>
+        <w:t xml:space="preserve">‎bankfas-v1.0.4‎</w:t>
       </w:r>
       <w:r>
         <w:rPr>
@@ -2352,7 +2587,7 @@
                 <w:shd w:fill="F1F3F5" w:color="auto" w:val="clear"/>
                 <w:rtl/>
               </w:rPr>
-              <w:t xml:space="preserve">‎bankfas-api-1.0.3.tar.gz‎</w:t>
+              <w:t xml:space="preserve">‎bankfas-api-1.0.4.tar.gz‎</w:t>
             </w:r>
           </w:p>
         </w:tc>
@@ -2432,7 +2667,7 @@
                 <w:shd w:fill="F1F3F5" w:color="auto" w:val="clear"/>
                 <w:rtl/>
               </w:rPr>
-              <w:t xml:space="preserve">‎bankfas-worker-1.0.3.tar.gz‎</w:t>
+              <w:t xml:space="preserve">‎bankfas-worker-1.0.4.tar.gz‎</w:t>
             </w:r>
           </w:p>
         </w:tc>
@@ -2512,7 +2747,7 @@
                 <w:shd w:fill="F1F3F5" w:color="auto" w:val="clear"/>
                 <w:rtl/>
               </w:rPr>
-              <w:t xml:space="preserve">‎bankfas-source-1.0.3.tar.gz‎</w:t>
+              <w:t xml:space="preserve">‎bankfas-source-1.0.4.tar.gz‎</w:t>
             </w:r>
           </w:p>
         </w:tc>
@@ -3051,7 +3286,7 @@
           <w:szCs w:val="17"/>
           <w:rtl w:val="false"/>
         </w:rPr>
-        <w:t xml:space="preserve">cd ~/bankfas-1.0.3</w:t>
+        <w:t xml:space="preserve">cd ~/bankfas-1.0.4</w:t>
       </w:r>
     </w:p>
     <w:p>
@@ -3105,7 +3340,7 @@
           <w:szCs w:val="17"/>
           <w:rtl w:val="false"/>
         </w:rPr>
-        <w:t xml:space="preserve">tar -xzf bankfas-source-1.0.3.tar.gz</w:t>
+        <w:t xml:space="preserve">tar -xzf bankfas-source-1.0.4.tar.gz</w:t>
       </w:r>
     </w:p>
     <w:p>
@@ -3287,7 +3522,7 @@
           <w:szCs w:val="17"/>
           <w:rtl w:val="false"/>
         </w:rPr>
-        <w:t xml:space="preserve">sudo docker load -i ~/bankfas-1.0.3/bankfas-api-1.0.3.tar.gz</w:t>
+        <w:t xml:space="preserve">sudo docker load -i ~/bankfas-1.0.4/bankfas-api-1.0.4.tar.gz</w:t>
       </w:r>
     </w:p>
     <w:p>
@@ -3314,7 +3549,7 @@
           <w:szCs w:val="17"/>
           <w:rtl w:val="false"/>
         </w:rPr>
-        <w:t xml:space="preserve">sudo docker load -i ~/bankfas-1.0.3/bankfas-worker-1.0.3.tar.gz</w:t>
+        <w:t xml:space="preserve">sudo docker load -i ~/bankfas-1.0.4/bankfas-worker-1.0.4.tar.gz</w:t>
       </w:r>
     </w:p>
     <w:p>
@@ -3341,7 +3576,7 @@
           <w:szCs w:val="17"/>
           <w:rtl w:val="false"/>
         </w:rPr>
-        <w:t xml:space="preserve">sudo docker image ls | grep bankfas    # bankfas-api:1.0.3 و bankfas-worker:1.0.3</w:t>
+        <w:t xml:space="preserve">sudo docker image ls | grep bankfas    # bankfas-api:1.0.4 و bankfas-worker:1.0.4</w:t>
       </w:r>
     </w:p>
     <w:p>
@@ -3406,7 +3641,7 @@
           <w:shd w:fill="F1F3F5" w:color="auto" w:val="clear"/>
           <w:rtl/>
         </w:rPr>
-        <w:t xml:space="preserve">‎bankfas-api:1.0.3‎</w:t>
+        <w:t xml:space="preserve">‎bankfas-api:1.0.4‎</w:t>
       </w:r>
       <w:r>
         <w:rPr>
@@ -3430,7 +3665,7 @@
           <w:shd w:fill="F1F3F5" w:color="auto" w:val="clear"/>
           <w:rtl/>
         </w:rPr>
-        <w:t xml:space="preserve">‎bankfas-worker:1.0.3‎</w:t>
+        <w:t xml:space="preserve">‎bankfas-worker:1.0.4‎</w:t>
       </w:r>
       <w:r>
         <w:rPr>

</xml_diff>

<commit_message>
Release 1.0.6: the English screens show the server's codes as words [release]
The pilot release 1.0.6: in English every code of the server shows as a word (the facility
card: Active, Valid, Sole lender, Documentary credits, Shared cap), acronyms kept, and a
product line shows its product's name. No database change. docs/57, docs/59, docs/31 row 71.

Co-Authored-By: Claude Opus 5.5 <noreply@anthropic.com>
Claude-Session: https://claude.ai/code/session_012HHcRrzuvMBTL2FYxXtsyv
</commit_message>
<xml_diff>
--- a/treasury-platform/docs/57-RELEASE.docx
+++ b/treasury-platform/docs/57-RELEASE.docx
@@ -17,7 +17,7 @@
           <w:szCs w:val="48"/>
           <w:rtl/>
         </w:rPr>
-        <w:t xml:space="preserve">إصدارات التشغيل التجريبي، والإصدار الحالي 1.0.5 (الصفوف 60 و62 و66 و68 و69 في </w:t>
+        <w:t xml:space="preserve">إصدارات التشغيل التجريبي، والإصدار الحالي 1.0.6 (الصفوف 60 و62 و66 و68 و69 في </w:t>
       </w:r>
       <w:r>
         <w:rPr>
@@ -211,6 +211,28 @@
           <w:rtl/>
         </w:rPr>
         <w:t xml:space="preserve">الإصدار 1.0.5: «نعم أصدر 1.0.5».</w:t>
+      </w:r>
+    </w:p>
+    <w:p>
+      <w:pPr>
+        <w:pStyle w:val="ListParagraph"/>
+        <w:numPr>
+          <w:ilvl w:val="0"/>
+          <w:numId w:val="2"/>
+        </w:numPr>
+        <w:bidi/>
+        <w:spacing w:after="70" w:before="0" w:line="300"/>
+      </w:pPr>
+      <w:r>
+        <w:rPr>
+          <w:rFonts w:ascii="Arial" w:cs="Arial" w:eastAsia="Arial" w:hAnsi="Arial"/>
+          <w:b w:val="false"/>
+          <w:bCs w:val="false"/>
+          <w:sz w:val="21"/>
+          <w:szCs w:val="21"/>
+          <w:rtl/>
+        </w:rPr>
+        <w:t xml:space="preserve">الإصدار 1.0.6: «اصلح الرموز في بطاقة التسهيل وأصدر 1.0.6».</w:t>
       </w:r>
     </w:p>
     <w:p>
@@ -413,7 +435,7 @@
                 <w:szCs w:val="18"/>
                 <w:rtl/>
               </w:rPr>
-              <w:t xml:space="preserve">1.0.5</w:t>
+              <w:t xml:space="preserve">1.0.6</w:t>
             </w:r>
           </w:p>
         </w:tc>
@@ -485,7 +507,7 @@
                 <w:szCs w:val="18"/>
                 <w:rtl/>
               </w:rPr>
-              <w:t xml:space="preserve">شاشة الشروط بالإنجليزية: قيم القوائم والرسوم كلمات إنجليزية بدل الرموز، وعناوين مربعات النص بحجم باقي العناوين (</w:t>
+              <w:t xml:space="preserve">في الشاشات الإنجليزية يظهر كل رمز من الخادم كلمة: الحالات، وأدوار البنوك، وأنواع الحدود، وأنماط التوزيع وغيرها، والاختصارات كما هي. وخطوط المنتج في الحدود باسم المنتج (</w:t>
             </w:r>
             <w:r>
               <w:rPr>
@@ -498,18 +520,18 @@
                 <w:shd w:fill="F1F3F5" w:color="auto" w:val="clear"/>
                 <w:rtl/>
               </w:rPr>
-              <w:t xml:space="preserve">‎docs/59‎</w:t>
-            </w:r>
-            <w:r>
-              <w:rPr>
-                <w:rFonts w:ascii="Arial" w:cs="Arial" w:eastAsia="Arial" w:hAnsi="Arial"/>
-                <w:b w:val="false"/>
-                <w:bCs w:val="false"/>
-                <w:sz w:val="18"/>
-                <w:szCs w:val="18"/>
-                <w:rtl/>
-              </w:rPr>
-              <w:t xml:space="preserve"> §4)</w:t>
+              <w:t xml:space="preserve">‎docs/31‎</w:t>
+            </w:r>
+            <w:r>
+              <w:rPr>
+                <w:rFonts w:ascii="Arial" w:cs="Arial" w:eastAsia="Arial" w:hAnsi="Arial"/>
+                <w:b w:val="false"/>
+                <w:bCs w:val="false"/>
+                <w:sz w:val="18"/>
+                <w:szCs w:val="18"/>
+                <w:rtl/>
+              </w:rPr>
+              <w:t xml:space="preserve"> الصف 71)</w:t>
             </w:r>
           </w:p>
         </w:tc>
@@ -551,7 +573,7 @@
                 <w:szCs w:val="18"/>
                 <w:rtl/>
               </w:rPr>
-              <w:t xml:space="preserve">1.0.4</w:t>
+              <w:t xml:space="preserve">1.0.5</w:t>
             </w:r>
           </w:p>
         </w:tc>
@@ -625,7 +647,7 @@
                 <w:szCs w:val="18"/>
                 <w:rtl/>
               </w:rPr>
-              <w:t xml:space="preserve">تصنيف البضاعة باسمه من الكتالوج في الشاشة والمطبوع، والإنجليزية لغة افتراضية للشاشات والمطبوعات والبريد، والعربية خيار يحفظه المستخدم (</w:t>
+              <w:t xml:space="preserve">شاشة الشروط بالإنجليزية: قيم القوائم والرسوم كلمات إنجليزية بدل الرموز، وعناوين مربعات النص بحجم باقي العناوين (</w:t>
             </w:r>
             <w:r>
               <w:rPr>
@@ -638,18 +660,18 @@
                 <w:shd w:fill="F1F3F5" w:color="auto" w:val="clear"/>
                 <w:rtl/>
               </w:rPr>
-              <w:t xml:space="preserve">‎docs/60‎</w:t>
-            </w:r>
-            <w:r>
-              <w:rPr>
-                <w:rFonts w:ascii="Arial" w:cs="Arial" w:eastAsia="Arial" w:hAnsi="Arial"/>
-                <w:b w:val="false"/>
-                <w:bCs w:val="false"/>
-                <w:sz w:val="18"/>
-                <w:szCs w:val="18"/>
-                <w:rtl/>
-              </w:rPr>
-              <w:t xml:space="preserve"> §8)</w:t>
+              <w:t xml:space="preserve">‎docs/59‎</w:t>
+            </w:r>
+            <w:r>
+              <w:rPr>
+                <w:rFonts w:ascii="Arial" w:cs="Arial" w:eastAsia="Arial" w:hAnsi="Arial"/>
+                <w:b w:val="false"/>
+                <w:bCs w:val="false"/>
+                <w:sz w:val="18"/>
+                <w:szCs w:val="18"/>
+                <w:rtl/>
+              </w:rPr>
+              <w:t xml:space="preserve"> §4)</w:t>
             </w:r>
           </w:p>
         </w:tc>
@@ -690,7 +712,7 @@
                 <w:szCs w:val="18"/>
                 <w:rtl/>
               </w:rPr>
-              <w:t xml:space="preserve">1.0.3</w:t>
+              <w:t xml:space="preserve">1.0.4</w:t>
             </w:r>
           </w:p>
         </w:tc>
@@ -762,7 +784,7 @@
                 <w:szCs w:val="18"/>
                 <w:rtl/>
               </w:rPr>
-              <w:t xml:space="preserve">شروط الاعتماد برمز حقل سويفت MT700 بدل مراجع UCP في الشاشة والمطبوع، والقيم بالعربية، وكل حقول MT700 في القاموس، منها 47A و44A و44B و40A و58a. ولا أيام تأجيل لاعتماد الاطلاع (</w:t>
+              <w:t xml:space="preserve">تصنيف البضاعة باسمه من الكتالوج في الشاشة والمطبوع، والإنجليزية لغة افتراضية للشاشات والمطبوعات والبريد، والعربية خيار يحفظه المستخدم (</w:t>
             </w:r>
             <w:r>
               <w:rPr>
@@ -786,7 +808,7 @@
                 <w:szCs w:val="18"/>
                 <w:rtl/>
               </w:rPr>
-              <w:t xml:space="preserve"> §6 و§7)</w:t>
+              <w:t xml:space="preserve"> §8)</w:t>
             </w:r>
           </w:p>
         </w:tc>
@@ -828,7 +850,7 @@
                 <w:szCs w:val="18"/>
                 <w:rtl/>
               </w:rPr>
-              <w:t xml:space="preserve">1.0.2</w:t>
+              <w:t xml:space="preserve">1.0.3</w:t>
             </w:r>
           </w:p>
         </w:tc>
@@ -902,7 +924,7 @@
                 <w:szCs w:val="18"/>
                 <w:rtl/>
               </w:rPr>
-              <w:t xml:space="preserve">مراجع UCP 600 بجانب حقول شروط الاعتماد ومستنداته، وفحوص المواد 28 و29 و31-32 و19-24 (</w:t>
+              <w:t xml:space="preserve">شروط الاعتماد برمز حقل سويفت MT700 بدل مراجع UCP في الشاشة والمطبوع، والقيم بالعربية، وكل حقول MT700 في القاموس، منها 47A و44A و44B و40A و58a. ولا أيام تأجيل لاعتماد الاطلاع (</w:t>
             </w:r>
             <w:r>
               <w:rPr>
@@ -926,116 +948,7 @@
                 <w:szCs w:val="18"/>
                 <w:rtl/>
               </w:rPr>
-              <w:t xml:space="preserve">). ودعم الخادم الواحد للتجربة (</w:t>
-            </w:r>
-            <w:r>
-              <w:rPr>
-                <w:rFonts w:ascii="Courier New" w:cs="Courier New" w:eastAsia="Courier New" w:hAnsi="Courier New"/>
-                <w:b w:val="false"/>
-                <w:bCs w:val="false"/>
-                <w:color w:val="1F2937"/>
-                <w:sz w:val="16"/>
-                <w:szCs w:val="16"/>
-                <w:shd w:fill="F1F3F5" w:color="auto" w:val="clear"/>
-                <w:rtl/>
-              </w:rPr>
-              <w:t xml:space="preserve">‎docs/58‎</w:t>
-            </w:r>
-            <w:r>
-              <w:rPr>
-                <w:rFonts w:ascii="Arial" w:cs="Arial" w:eastAsia="Arial" w:hAnsi="Arial"/>
-                <w:b w:val="false"/>
-                <w:bCs w:val="false"/>
-                <w:sz w:val="18"/>
-                <w:szCs w:val="18"/>
-                <w:rtl/>
-              </w:rPr>
-              <w:t xml:space="preserve">): </w:t>
-            </w:r>
-            <w:r>
-              <w:rPr>
-                <w:rFonts w:ascii="Courier New" w:cs="Courier New" w:eastAsia="Courier New" w:hAnsi="Courier New"/>
-                <w:b w:val="false"/>
-                <w:bCs w:val="false"/>
-                <w:color w:val="1F2937"/>
-                <w:sz w:val="16"/>
-                <w:szCs w:val="16"/>
-                <w:shd w:fill="F1F3F5" w:color="auto" w:val="clear"/>
-                <w:rtl/>
-              </w:rPr>
-              <w:t xml:space="preserve">‎DB_ADDRESS‎</w:t>
-            </w:r>
-            <w:r>
-              <w:rPr>
-                <w:rFonts w:ascii="Arial" w:cs="Arial" w:eastAsia="Arial" w:hAnsi="Arial"/>
-                <w:b w:val="false"/>
-                <w:bCs w:val="false"/>
-                <w:sz w:val="18"/>
-                <w:szCs w:val="18"/>
-                <w:rtl/>
-              </w:rPr>
-              <w:t xml:space="preserve"> في </w:t>
-            </w:r>
-            <w:r>
-              <w:rPr>
-                <w:rFonts w:ascii="Courier New" w:cs="Courier New" w:eastAsia="Courier New" w:hAnsi="Courier New"/>
-                <w:b w:val="false"/>
-                <w:bCs w:val="false"/>
-                <w:color w:val="1F2937"/>
-                <w:sz w:val="16"/>
-                <w:szCs w:val="16"/>
-                <w:shd w:fill="F1F3F5" w:color="auto" w:val="clear"/>
-                <w:rtl/>
-              </w:rPr>
-              <w:t xml:space="preserve">‎site.conf‎</w:t>
-            </w:r>
-            <w:r>
-              <w:rPr>
-                <w:rFonts w:ascii="Arial" w:cs="Arial" w:eastAsia="Arial" w:hAnsi="Arial"/>
-                <w:b w:val="false"/>
-                <w:bCs w:val="false"/>
-                <w:sz w:val="18"/>
-                <w:szCs w:val="18"/>
-                <w:rtl/>
-              </w:rPr>
-              <w:t xml:space="preserve">، و</w:t>
-            </w:r>
-            <w:r>
-              <w:rPr>
-                <w:rFonts w:ascii="Courier New" w:cs="Courier New" w:eastAsia="Courier New" w:hAnsi="Courier New"/>
-                <w:b w:val="false"/>
-                <w:bCs w:val="false"/>
-                <w:color w:val="1F2937"/>
-                <w:sz w:val="16"/>
-                <w:szCs w:val="16"/>
-                <w:shd w:fill="F1F3F5" w:color="auto" w:val="clear"/>
-                <w:rtl/>
-              </w:rPr>
-              <w:t xml:space="preserve">‎DB_ON_THIS_HOST=1‎</w:t>
-            </w:r>
-            <w:r>
-              <w:rPr>
-                <w:rFonts w:ascii="Arial" w:cs="Arial" w:eastAsia="Arial" w:hAnsi="Arial"/>
-                <w:b w:val="false"/>
-                <w:bCs w:val="false"/>
-                <w:sz w:val="18"/>
-                <w:szCs w:val="18"/>
-                <w:rtl/>
-              </w:rPr>
-              <w:t xml:space="preserve"> في </w:t>
-            </w:r>
-            <w:r>
-              <w:rPr>
-                <w:rFonts w:ascii="Courier New" w:cs="Courier New" w:eastAsia="Courier New" w:hAnsi="Courier New"/>
-                <w:b w:val="false"/>
-                <w:bCs w:val="false"/>
-                <w:color w:val="1F2937"/>
-                <w:sz w:val="16"/>
-                <w:szCs w:val="16"/>
-                <w:shd w:fill="F1F3F5" w:color="auto" w:val="clear"/>
-                <w:rtl/>
-              </w:rPr>
-              <w:t xml:space="preserve">‎ufw.sh‎</w:t>
+              <w:t xml:space="preserve"> §6 و§7)</w:t>
             </w:r>
           </w:p>
         </w:tc>
@@ -1076,7 +989,7 @@
                 <w:szCs w:val="18"/>
                 <w:rtl/>
               </w:rPr>
-              <w:t xml:space="preserve">1.0.1</w:t>
+              <w:t xml:space="preserve">1.0.2</w:t>
             </w:r>
           </w:p>
         </w:tc>
@@ -1112,7 +1025,7 @@
                 <w:szCs w:val="18"/>
                 <w:rtl/>
               </w:rPr>
-              <w:t xml:space="preserve">2026-10-25</w:t>
+              <w:t xml:space="preserve">2026-10-26</w:t>
             </w:r>
           </w:p>
         </w:tc>
@@ -1148,7 +1061,7 @@
                 <w:szCs w:val="18"/>
                 <w:rtl/>
               </w:rPr>
-              <w:t xml:space="preserve">تقرير التقييم الائتماني المطبوع بغلافه وصفحاته الداخلية على الهوية (</w:t>
+              <w:t xml:space="preserve">مراجع UCP 600 بجانب حقول شروط الاعتماد ومستنداته، وفحوص المواد 28 و29 و31-32 و19-24 (</w:t>
             </w:r>
             <w:r>
               <w:rPr>
@@ -1161,18 +1074,127 @@
                 <w:shd w:fill="F1F3F5" w:color="auto" w:val="clear"/>
                 <w:rtl/>
               </w:rPr>
-              <w:t xml:space="preserve">‎docs/56‎</w:t>
-            </w:r>
-            <w:r>
-              <w:rPr>
-                <w:rFonts w:ascii="Arial" w:cs="Arial" w:eastAsia="Arial" w:hAnsi="Arial"/>
-                <w:b w:val="false"/>
-                <w:bCs w:val="false"/>
-                <w:sz w:val="18"/>
-                <w:szCs w:val="18"/>
-                <w:rtl/>
-              </w:rPr>
-              <w:t xml:space="preserve"> §7)، برابطي «طباعة التقرير» و«تنزيل PDF» في شاشة التقييم. ودليل التثبيت صار جزءًا من كل إصدار باسم ثابت</w:t>
+              <w:t xml:space="preserve">‎docs/60‎</w:t>
+            </w:r>
+            <w:r>
+              <w:rPr>
+                <w:rFonts w:ascii="Arial" w:cs="Arial" w:eastAsia="Arial" w:hAnsi="Arial"/>
+                <w:b w:val="false"/>
+                <w:bCs w:val="false"/>
+                <w:sz w:val="18"/>
+                <w:szCs w:val="18"/>
+                <w:rtl/>
+              </w:rPr>
+              <w:t xml:space="preserve">). ودعم الخادم الواحد للتجربة (</w:t>
+            </w:r>
+            <w:r>
+              <w:rPr>
+                <w:rFonts w:ascii="Courier New" w:cs="Courier New" w:eastAsia="Courier New" w:hAnsi="Courier New"/>
+                <w:b w:val="false"/>
+                <w:bCs w:val="false"/>
+                <w:color w:val="1F2937"/>
+                <w:sz w:val="16"/>
+                <w:szCs w:val="16"/>
+                <w:shd w:fill="F1F3F5" w:color="auto" w:val="clear"/>
+                <w:rtl/>
+              </w:rPr>
+              <w:t xml:space="preserve">‎docs/58‎</w:t>
+            </w:r>
+            <w:r>
+              <w:rPr>
+                <w:rFonts w:ascii="Arial" w:cs="Arial" w:eastAsia="Arial" w:hAnsi="Arial"/>
+                <w:b w:val="false"/>
+                <w:bCs w:val="false"/>
+                <w:sz w:val="18"/>
+                <w:szCs w:val="18"/>
+                <w:rtl/>
+              </w:rPr>
+              <w:t xml:space="preserve">): </w:t>
+            </w:r>
+            <w:r>
+              <w:rPr>
+                <w:rFonts w:ascii="Courier New" w:cs="Courier New" w:eastAsia="Courier New" w:hAnsi="Courier New"/>
+                <w:b w:val="false"/>
+                <w:bCs w:val="false"/>
+                <w:color w:val="1F2937"/>
+                <w:sz w:val="16"/>
+                <w:szCs w:val="16"/>
+                <w:shd w:fill="F1F3F5" w:color="auto" w:val="clear"/>
+                <w:rtl/>
+              </w:rPr>
+              <w:t xml:space="preserve">‎DB_ADDRESS‎</w:t>
+            </w:r>
+            <w:r>
+              <w:rPr>
+                <w:rFonts w:ascii="Arial" w:cs="Arial" w:eastAsia="Arial" w:hAnsi="Arial"/>
+                <w:b w:val="false"/>
+                <w:bCs w:val="false"/>
+                <w:sz w:val="18"/>
+                <w:szCs w:val="18"/>
+                <w:rtl/>
+              </w:rPr>
+              <w:t xml:space="preserve"> في </w:t>
+            </w:r>
+            <w:r>
+              <w:rPr>
+                <w:rFonts w:ascii="Courier New" w:cs="Courier New" w:eastAsia="Courier New" w:hAnsi="Courier New"/>
+                <w:b w:val="false"/>
+                <w:bCs w:val="false"/>
+                <w:color w:val="1F2937"/>
+                <w:sz w:val="16"/>
+                <w:szCs w:val="16"/>
+                <w:shd w:fill="F1F3F5" w:color="auto" w:val="clear"/>
+                <w:rtl/>
+              </w:rPr>
+              <w:t xml:space="preserve">‎site.conf‎</w:t>
+            </w:r>
+            <w:r>
+              <w:rPr>
+                <w:rFonts w:ascii="Arial" w:cs="Arial" w:eastAsia="Arial" w:hAnsi="Arial"/>
+                <w:b w:val="false"/>
+                <w:bCs w:val="false"/>
+                <w:sz w:val="18"/>
+                <w:szCs w:val="18"/>
+                <w:rtl/>
+              </w:rPr>
+              <w:t xml:space="preserve">، و</w:t>
+            </w:r>
+            <w:r>
+              <w:rPr>
+                <w:rFonts w:ascii="Courier New" w:cs="Courier New" w:eastAsia="Courier New" w:hAnsi="Courier New"/>
+                <w:b w:val="false"/>
+                <w:bCs w:val="false"/>
+                <w:color w:val="1F2937"/>
+                <w:sz w:val="16"/>
+                <w:szCs w:val="16"/>
+                <w:shd w:fill="F1F3F5" w:color="auto" w:val="clear"/>
+                <w:rtl/>
+              </w:rPr>
+              <w:t xml:space="preserve">‎DB_ON_THIS_HOST=1‎</w:t>
+            </w:r>
+            <w:r>
+              <w:rPr>
+                <w:rFonts w:ascii="Arial" w:cs="Arial" w:eastAsia="Arial" w:hAnsi="Arial"/>
+                <w:b w:val="false"/>
+                <w:bCs w:val="false"/>
+                <w:sz w:val="18"/>
+                <w:szCs w:val="18"/>
+                <w:rtl/>
+              </w:rPr>
+              <w:t xml:space="preserve"> في </w:t>
+            </w:r>
+            <w:r>
+              <w:rPr>
+                <w:rFonts w:ascii="Courier New" w:cs="Courier New" w:eastAsia="Courier New" w:hAnsi="Courier New"/>
+                <w:b w:val="false"/>
+                <w:bCs w:val="false"/>
+                <w:color w:val="1F2937"/>
+                <w:sz w:val="16"/>
+                <w:szCs w:val="16"/>
+                <w:shd w:fill="F1F3F5" w:color="auto" w:val="clear"/>
+                <w:rtl/>
+              </w:rPr>
+              <w:t xml:space="preserve">‎ufw.sh‎</w:t>
             </w:r>
           </w:p>
         </w:tc>
@@ -1214,6 +1236,145 @@
                 <w:szCs w:val="18"/>
                 <w:rtl/>
               </w:rPr>
+              <w:t xml:space="preserve">1.0.1</w:t>
+            </w:r>
+          </w:p>
+        </w:tc>
+        <w:tc>
+          <w:tcPr>
+            <w:tcW w:type="dxa" w:w="2818"/>
+            <w:tcBorders>
+              <w:top w:val="single" w:color="BFC9D6" w:sz="4"/>
+              <w:left w:val="single" w:color="BFC9D6" w:sz="4"/>
+              <w:bottom w:val="single" w:color="BFC9D6" w:sz="4"/>
+              <w:right w:val="single" w:color="BFC9D6" w:sz="4"/>
+            </w:tcBorders>
+            <w:shd w:fill="F5F8FC" w:color="auto" w:val="clear"/>
+            <w:tcMar>
+              <w:top w:type="dxa" w:w="50"/>
+              <w:left w:type="dxa" w:w="90"/>
+              <w:bottom w:type="dxa" w:w="50"/>
+              <w:right w:type="dxa" w:w="90"/>
+            </w:tcMar>
+            <w:vAlign w:val="top"/>
+          </w:tcPr>
+          <w:p>
+            <w:pPr>
+              <w:keepNext w:val="false"/>
+              <w:bidi/>
+              <w:spacing w:after="30" w:before="30" w:line="264"/>
+            </w:pPr>
+            <w:r>
+              <w:rPr>
+                <w:rFonts w:ascii="Arial" w:cs="Arial" w:eastAsia="Arial" w:hAnsi="Arial"/>
+                <w:b w:val="false"/>
+                <w:bCs w:val="false"/>
+                <w:sz w:val="18"/>
+                <w:szCs w:val="18"/>
+                <w:rtl/>
+              </w:rPr>
+              <w:t xml:space="preserve">2026-10-25</w:t>
+            </w:r>
+          </w:p>
+        </w:tc>
+        <w:tc>
+          <w:tcPr>
+            <w:tcW w:type="dxa" w:w="5074"/>
+            <w:tcBorders>
+              <w:top w:val="single" w:color="BFC9D6" w:sz="4"/>
+              <w:left w:val="single" w:color="BFC9D6" w:sz="4"/>
+              <w:bottom w:val="single" w:color="BFC9D6" w:sz="4"/>
+              <w:right w:val="single" w:color="BFC9D6" w:sz="4"/>
+            </w:tcBorders>
+            <w:shd w:fill="F5F8FC" w:color="auto" w:val="clear"/>
+            <w:tcMar>
+              <w:top w:type="dxa" w:w="50"/>
+              <w:left w:type="dxa" w:w="90"/>
+              <w:bottom w:type="dxa" w:w="50"/>
+              <w:right w:type="dxa" w:w="90"/>
+            </w:tcMar>
+            <w:vAlign w:val="top"/>
+          </w:tcPr>
+          <w:p>
+            <w:pPr>
+              <w:keepNext w:val="false"/>
+              <w:bidi/>
+              <w:spacing w:after="30" w:before="30" w:line="264"/>
+            </w:pPr>
+            <w:r>
+              <w:rPr>
+                <w:rFonts w:ascii="Arial" w:cs="Arial" w:eastAsia="Arial" w:hAnsi="Arial"/>
+                <w:b w:val="false"/>
+                <w:bCs w:val="false"/>
+                <w:sz w:val="18"/>
+                <w:szCs w:val="18"/>
+                <w:rtl/>
+              </w:rPr>
+              <w:t xml:space="preserve">تقرير التقييم الائتماني المطبوع بغلافه وصفحاته الداخلية على الهوية (</w:t>
+            </w:r>
+            <w:r>
+              <w:rPr>
+                <w:rFonts w:ascii="Courier New" w:cs="Courier New" w:eastAsia="Courier New" w:hAnsi="Courier New"/>
+                <w:b w:val="false"/>
+                <w:bCs w:val="false"/>
+                <w:color w:val="1F2937"/>
+                <w:sz w:val="16"/>
+                <w:szCs w:val="16"/>
+                <w:shd w:fill="F1F3F5" w:color="auto" w:val="clear"/>
+                <w:rtl/>
+              </w:rPr>
+              <w:t xml:space="preserve">‎docs/56‎</w:t>
+            </w:r>
+            <w:r>
+              <w:rPr>
+                <w:rFonts w:ascii="Arial" w:cs="Arial" w:eastAsia="Arial" w:hAnsi="Arial"/>
+                <w:b w:val="false"/>
+                <w:bCs w:val="false"/>
+                <w:sz w:val="18"/>
+                <w:szCs w:val="18"/>
+                <w:rtl/>
+              </w:rPr>
+              <w:t xml:space="preserve"> §7)، برابطي «طباعة التقرير» و«تنزيل PDF» في شاشة التقييم. ودليل التثبيت صار جزءًا من كل إصدار باسم ثابت</w:t>
+            </w:r>
+          </w:p>
+        </w:tc>
+      </w:tr>
+      <w:tr>
+        <w:trPr>
+          <w:cantSplit/>
+        </w:trPr>
+        <w:tc>
+          <w:tcPr>
+            <w:tcW w:type="dxa" w:w="1972"/>
+            <w:tcBorders>
+              <w:top w:val="single" w:color="BFC9D6" w:sz="4"/>
+              <w:left w:val="single" w:color="BFC9D6" w:sz="4"/>
+              <w:bottom w:val="single" w:color="BFC9D6" w:sz="4"/>
+              <w:right w:val="single" w:color="BFC9D6" w:sz="4"/>
+            </w:tcBorders>
+            <w:tcMar>
+              <w:top w:type="dxa" w:w="50"/>
+              <w:left w:type="dxa" w:w="90"/>
+              <w:bottom w:type="dxa" w:w="50"/>
+              <w:right w:type="dxa" w:w="90"/>
+            </w:tcMar>
+            <w:vAlign w:val="top"/>
+          </w:tcPr>
+          <w:p>
+            <w:pPr>
+              <w:keepNext w:val="false"/>
+              <w:bidi/>
+              <w:spacing w:after="30" w:before="30" w:line="264"/>
+            </w:pPr>
+            <w:r>
+              <w:rPr>
+                <w:rFonts w:ascii="Arial" w:cs="Arial" w:eastAsia="Arial" w:hAnsi="Arial"/>
+                <w:b w:val="false"/>
+                <w:bCs w:val="false"/>
+                <w:sz w:val="18"/>
+                <w:szCs w:val="18"/>
+                <w:rtl/>
+              </w:rPr>
               <w:t xml:space="preserve">1.0.0</w:t>
             </w:r>
           </w:p>
@@ -1227,7 +1388,6 @@
               <w:bottom w:val="single" w:color="BFC9D6" w:sz="4"/>
               <w:right w:val="single" w:color="BFC9D6" w:sz="4"/>
             </w:tcBorders>
-            <w:shd w:fill="F5F8FC" w:color="auto" w:val="clear"/>
             <w:tcMar>
               <w:top w:type="dxa" w:w="50"/>
               <w:left w:type="dxa" w:w="90"/>
@@ -1264,7 +1424,6 @@
               <w:bottom w:val="single" w:color="BFC9D6" w:sz="4"/>
               <w:right w:val="single" w:color="BFC9D6" w:sz="4"/>
             </w:tcBorders>
-            <w:shd w:fill="F5F8FC" w:color="auto" w:val="clear"/>
             <w:tcMar>
               <w:top w:type="dxa" w:w="50"/>
               <w:left w:type="dxa" w:w="90"/>
@@ -1471,6 +1630,82 @@
     <w:p>
       <w:r>
         <w:br w:type="page"/>
+      </w:r>
+    </w:p>
+    <w:p>
+      <w:pPr>
+        <w:bidi/>
+        <w:spacing w:after="110" w:before="0" w:line="312"/>
+      </w:pPr>
+      <w:r>
+        <w:rPr>
+          <w:rFonts w:ascii="Arial" w:cs="Arial" w:eastAsia="Arial" w:hAnsi="Arial"/>
+          <w:b/>
+          <w:bCs/>
+          <w:sz w:val="21"/>
+          <w:szCs w:val="21"/>
+          <w:rtl/>
+        </w:rPr>
+        <w:t xml:space="preserve">الترقية من 1.0.5 إلى 1.0.6:</w:t>
+      </w:r>
+      <w:r>
+        <w:rPr>
+          <w:rFonts w:ascii="Arial" w:cs="Arial" w:eastAsia="Arial" w:hAnsi="Arial"/>
+          <w:b w:val="false"/>
+          <w:bCs w:val="false"/>
+          <w:sz w:val="21"/>
+          <w:szCs w:val="21"/>
+          <w:rtl/>
+        </w:rPr>
+        <w:t xml:space="preserve"> لا تغيير في قاعدة البيانات. تُحمَّل الصورتان الجديدتان، ثم يُغيَّر رقم الإصدار في </w:t>
+      </w:r>
+      <w:r>
+        <w:rPr>
+          <w:rFonts w:ascii="Courier New" w:cs="Courier New" w:eastAsia="Courier New" w:hAnsi="Courier New"/>
+          <w:b w:val="false"/>
+          <w:bCs w:val="false"/>
+          <w:color w:val="1F2937"/>
+          <w:sz w:val="18"/>
+          <w:szCs w:val="18"/>
+          <w:shd w:fill="F1F3F5" w:color="auto" w:val="clear"/>
+          <w:rtl/>
+        </w:rPr>
+        <w:t xml:space="preserve">‎compose.yml‎</w:t>
+      </w:r>
+      <w:r>
+        <w:rPr>
+          <w:rFonts w:ascii="Arial" w:cs="Arial" w:eastAsia="Arial" w:hAnsi="Arial"/>
+          <w:b w:val="false"/>
+          <w:bCs w:val="false"/>
+          <w:sz w:val="21"/>
+          <w:szCs w:val="21"/>
+          <w:rtl/>
+        </w:rPr>
+        <w:t xml:space="preserve">، ثم </w:t>
+      </w:r>
+      <w:r>
+        <w:rPr>
+          <w:rFonts w:ascii="Courier New" w:cs="Courier New" w:eastAsia="Courier New" w:hAnsi="Courier New"/>
+          <w:b w:val="false"/>
+          <w:bCs w:val="false"/>
+          <w:color w:val="1F2937"/>
+          <w:sz w:val="18"/>
+          <w:szCs w:val="18"/>
+          <w:shd w:fill="F1F3F5" w:color="auto" w:val="clear"/>
+          <w:rtl/>
+        </w:rPr>
+        <w:t xml:space="preserve">‎sudo docker compose up -d‎</w:t>
+      </w:r>
+      <w:r>
+        <w:rPr>
+          <w:rFonts w:ascii="Arial" w:cs="Arial" w:eastAsia="Arial" w:hAnsi="Arial"/>
+          <w:b w:val="false"/>
+          <w:bCs w:val="false"/>
+          <w:sz w:val="21"/>
+          <w:szCs w:val="21"/>
+          <w:rtl/>
+        </w:rPr>
+        <w:t xml:space="preserve">.</w:t>
       </w:r>
     </w:p>
     <w:p>
@@ -2674,7 +2909,7 @@
           <w:shd w:fill="F1F3F5" w:color="auto" w:val="clear"/>
           <w:rtl/>
         </w:rPr>
-        <w:t xml:space="preserve">‎bankfas-v1.0.5‎</w:t>
+        <w:t xml:space="preserve">‎bankfas-v1.0.6‎</w:t>
       </w:r>
       <w:r>
         <w:rPr>
@@ -2825,7 +3060,7 @@
                 <w:shd w:fill="F1F3F5" w:color="auto" w:val="clear"/>
                 <w:rtl/>
               </w:rPr>
-              <w:t xml:space="preserve">‎bankfas-api-1.0.5.tar.gz‎</w:t>
+              <w:t xml:space="preserve">‎bankfas-api-1.0.6.tar.gz‎</w:t>
             </w:r>
           </w:p>
         </w:tc>
@@ -2905,7 +3140,7 @@
                 <w:shd w:fill="F1F3F5" w:color="auto" w:val="clear"/>
                 <w:rtl/>
               </w:rPr>
-              <w:t xml:space="preserve">‎bankfas-worker-1.0.5.tar.gz‎</w:t>
+              <w:t xml:space="preserve">‎bankfas-worker-1.0.6.tar.gz‎</w:t>
             </w:r>
           </w:p>
         </w:tc>
@@ -2985,7 +3220,7 @@
                 <w:shd w:fill="F1F3F5" w:color="auto" w:val="clear"/>
                 <w:rtl/>
               </w:rPr>
-              <w:t xml:space="preserve">‎bankfas-source-1.0.5.tar.gz‎</w:t>
+              <w:t xml:space="preserve">‎bankfas-source-1.0.6.tar.gz‎</w:t>
             </w:r>
           </w:p>
         </w:tc>
@@ -3524,7 +3759,7 @@
           <w:szCs w:val="17"/>
           <w:rtl w:val="false"/>
         </w:rPr>
-        <w:t xml:space="preserve">cd ~/bankfas-1.0.5</w:t>
+        <w:t xml:space="preserve">cd ~/bankfas-1.0.6</w:t>
       </w:r>
     </w:p>
     <w:p>
@@ -3578,7 +3813,7 @@
           <w:szCs w:val="17"/>
           <w:rtl w:val="false"/>
         </w:rPr>
-        <w:t xml:space="preserve">tar -xzf bankfas-source-1.0.5.tar.gz</w:t>
+        <w:t xml:space="preserve">tar -xzf bankfas-source-1.0.6.tar.gz</w:t>
       </w:r>
     </w:p>
     <w:p>
@@ -3760,7 +3995,7 @@
           <w:szCs w:val="17"/>
           <w:rtl w:val="false"/>
         </w:rPr>
-        <w:t xml:space="preserve">sudo docker load -i ~/bankfas-1.0.5/bankfas-api-1.0.5.tar.gz</w:t>
+        <w:t xml:space="preserve">sudo docker load -i ~/bankfas-1.0.6/bankfas-api-1.0.6.tar.gz</w:t>
       </w:r>
     </w:p>
     <w:p>
@@ -3787,7 +4022,7 @@
           <w:szCs w:val="17"/>
           <w:rtl w:val="false"/>
         </w:rPr>
-        <w:t xml:space="preserve">sudo docker load -i ~/bankfas-1.0.5/bankfas-worker-1.0.5.tar.gz</w:t>
+        <w:t xml:space="preserve">sudo docker load -i ~/bankfas-1.0.6/bankfas-worker-1.0.6.tar.gz</w:t>
       </w:r>
     </w:p>
     <w:p>
@@ -3814,7 +4049,7 @@
           <w:szCs w:val="17"/>
           <w:rtl w:val="false"/>
         </w:rPr>
-        <w:t xml:space="preserve">sudo docker image ls | grep bankfas    # bankfas-api:1.0.5 و bankfas-worker:1.0.5</w:t>
+        <w:t xml:space="preserve">sudo docker image ls | grep bankfas    # bankfas-api:1.0.6 و bankfas-worker:1.0.6</w:t>
       </w:r>
     </w:p>
     <w:p>
@@ -3879,7 +4114,7 @@
           <w:shd w:fill="F1F3F5" w:color="auto" w:val="clear"/>
           <w:rtl/>
         </w:rPr>
-        <w:t xml:space="preserve">‎bankfas-api:1.0.5‎</w:t>
+        <w:t xml:space="preserve">‎bankfas-api:1.0.6‎</w:t>
       </w:r>
       <w:r>
         <w:rPr>
@@ -3903,7 +4138,7 @@
           <w:shd w:fill="F1F3F5" w:color="auto" w:val="clear"/>
           <w:rtl/>
         </w:rPr>
-        <w:t xml:space="preserve">‎bankfas-worker:1.0.5‎</w:t>
+        <w:t xml:space="preserve">‎bankfas-worker:1.0.6‎</w:t>
       </w:r>
       <w:r>
         <w:rPr>

</xml_diff>

<commit_message>
Release 1.0.8: the facility file, the bank's products and the company number of a request [release]
Everything since 1.0.7: the company number of a request and its references (docs/31 row 72), a screen
per request category (row 73), the facility file with its contracts and correspondence (row 75), and
the bank relationship's products with their agreed rates, volumes and the cross-sale view (row 76).
The upgrade from 1.0.7 runs migrations V0001 to V0003 (docs/57, docs/62 section 16.7).

Co-Authored-By: Claude Opus 5.5 <noreply@anthropic.com>
Claude-Session: https://claude.ai/code/session_012HHcRrzuvMBTL2FYxXtsyv
</commit_message>
<xml_diff>
--- a/treasury-platform/docs/57-RELEASE.docx
+++ b/treasury-platform/docs/57-RELEASE.docx
@@ -17,7 +17,7 @@
           <w:szCs w:val="48"/>
           <w:rtl/>
         </w:rPr>
-        <w:t xml:space="preserve">إصدارات التشغيل التجريبي، والإصدار الحالي 1.0.7 (الصفوف 60 و62 و66 و68 و69 و74 في </w:t>
+        <w:t xml:space="preserve">إصدارات التشغيل التجريبي، والإصدار الحالي 1.0.8 (الصفوف 60 و62 و66 و68 و69 و74 و77 في </w:t>
       </w:r>
       <w:r>
         <w:rPr>
@@ -255,6 +255,28 @@
           <w:rtl/>
         </w:rPr>
         <w:t xml:space="preserve">الإصدار 1.0.7: «احتاج بيئة تجريبية خاص دون الحاجة للنشر العام... اعطني حزمة نشر لتجربة النظام ووضع ملاحظات دون ربط بموقع عام»، و«مباشرة عبر Ip السيرفر»، و«الوثائق اجعلها في ملف منفصل»، و«فقط انكليزي و عربي».</w:t>
+      </w:r>
+    </w:p>
+    <w:p>
+      <w:pPr>
+        <w:pStyle w:val="ListParagraph"/>
+        <w:numPr>
+          <w:ilvl w:val="0"/>
+          <w:numId w:val="2"/>
+        </w:numPr>
+        <w:bidi/>
+        <w:spacing w:after="70" w:before="0" w:line="300"/>
+      </w:pPr>
+      <w:r>
+        <w:rPr>
+          <w:rFonts w:ascii="Arial" w:cs="Arial" w:eastAsia="Arial" w:hAnsi="Arial"/>
+          <w:b w:val="false"/>
+          <w:bCs w:val="false"/>
+          <w:sz w:val="21"/>
+          <w:szCs w:val="21"/>
+          <w:rtl/>
+        </w:rPr>
+        <w:t xml:space="preserve">الإصدار 1.0.8: «اعطني ملف الحزمة لرفعها على السيرفر و تجربة النظام».</w:t>
       </w:r>
     </w:p>
     <w:p>
@@ -297,9 +319,9 @@
         </w:tblBorders>
       </w:tblPr>
       <w:tblGrid>
-        <w:gridCol w:w="1972"/>
-        <w:gridCol w:w="2818"/>
-        <w:gridCol w:w="5074"/>
+        <w:gridCol w:w="1918"/>
+        <w:gridCol w:w="2740"/>
+        <w:gridCol w:w="5206"/>
       </w:tblGrid>
       <w:tr>
         <w:trPr>
@@ -308,7 +330,7 @@
         </w:trPr>
         <w:tc>
           <w:tcPr>
-            <w:tcW w:type="dxa" w:w="1972"/>
+            <w:tcW w:type="dxa" w:w="1918"/>
             <w:tcBorders>
               <w:top w:val="single" w:color="BFC9D6" w:sz="4"/>
               <w:left w:val="single" w:color="BFC9D6" w:sz="4"/>
@@ -346,7 +368,7 @@
         </w:tc>
         <w:tc>
           <w:tcPr>
-            <w:tcW w:type="dxa" w:w="2818"/>
+            <w:tcW w:type="dxa" w:w="2740"/>
             <w:tcBorders>
               <w:top w:val="single" w:color="BFC9D6" w:sz="4"/>
               <w:left w:val="single" w:color="BFC9D6" w:sz="4"/>
@@ -384,7 +406,7 @@
         </w:tc>
         <w:tc>
           <w:tcPr>
-            <w:tcW w:type="dxa" w:w="5074"/>
+            <w:tcW w:type="dxa" w:w="5206"/>
             <w:tcBorders>
               <w:top w:val="single" w:color="BFC9D6" w:sz="4"/>
               <w:left w:val="single" w:color="BFC9D6" w:sz="4"/>
@@ -427,7 +449,7 @@
         </w:trPr>
         <w:tc>
           <w:tcPr>
-            <w:tcW w:type="dxa" w:w="1972"/>
+            <w:tcW w:type="dxa" w:w="1918"/>
             <w:tcBorders>
               <w:top w:val="single" w:color="BFC9D6" w:sz="4"/>
               <w:left w:val="single" w:color="BFC9D6" w:sz="4"/>
@@ -457,13 +479,13 @@
                 <w:szCs w:val="18"/>
                 <w:rtl/>
               </w:rPr>
-              <w:t xml:space="preserve">1.0.7</w:t>
+              <w:t xml:space="preserve">1.0.8</w:t>
             </w:r>
           </w:p>
         </w:tc>
         <w:tc>
           <w:tcPr>
-            <w:tcW w:type="dxa" w:w="2818"/>
+            <w:tcW w:type="dxa" w:w="2740"/>
             <w:tcBorders>
               <w:top w:val="single" w:color="BFC9D6" w:sz="4"/>
               <w:left w:val="single" w:color="BFC9D6" w:sz="4"/>
@@ -499,7 +521,7 @@
         </w:tc>
         <w:tc>
           <w:tcPr>
-            <w:tcW w:type="dxa" w:w="5074"/>
+            <w:tcW w:type="dxa" w:w="5206"/>
             <w:tcBorders>
               <w:top w:val="single" w:color="BFC9D6" w:sz="4"/>
               <w:left w:val="single" w:color="BFC9D6" w:sz="4"/>
@@ -523,13 +545,24 @@
             <w:r>
               <w:rPr>
                 <w:rFonts w:ascii="Arial" w:cs="Arial" w:eastAsia="Arial" w:hAnsi="Arial"/>
-                <w:b w:val="false"/>
-                <w:bCs w:val="false"/>
-                <w:sz w:val="18"/>
-                <w:szCs w:val="18"/>
-                <w:rtl/>
-              </w:rPr>
-              <w:t xml:space="preserve">التجربة الخاصة بعنوان IP دون نطاق (</w:t>
+                <w:b/>
+                <w:bCs/>
+                <w:sz w:val="18"/>
+                <w:szCs w:val="18"/>
+                <w:rtl/>
+              </w:rPr>
+              <w:t xml:space="preserve">ملف التسهيلات</w:t>
+            </w:r>
+            <w:r>
+              <w:rPr>
+                <w:rFonts w:ascii="Arial" w:cs="Arial" w:eastAsia="Arial" w:hAnsi="Arial"/>
+                <w:b w:val="false"/>
+                <w:bCs w:val="false"/>
+                <w:sz w:val="18"/>
+                <w:szCs w:val="18"/>
+                <w:rtl/>
+              </w:rPr>
+              <w:t xml:space="preserve"> لكل شركة مع كل بنك (</w:t>
             </w:r>
             <w:r>
               <w:rPr>
@@ -542,18 +575,18 @@
                 <w:shd w:fill="F1F3F5" w:color="auto" w:val="clear"/>
                 <w:rtl/>
               </w:rPr>
-              <w:t xml:space="preserve">‎docs/62‎</w:t>
-            </w:r>
-            <w:r>
-              <w:rPr>
-                <w:rFonts w:ascii="Arial" w:cs="Arial" w:eastAsia="Arial" w:hAnsi="Arial"/>
-                <w:b w:val="false"/>
-                <w:bCs w:val="false"/>
-                <w:sz w:val="18"/>
-                <w:szCs w:val="18"/>
-                <w:rtl/>
-              </w:rPr>
-              <w:t xml:space="preserve">): بوابة الشركة التجريبية على </w:t>
+              <w:t xml:space="preserve">‎SA05-ANB-0001‎</w:t>
+            </w:r>
+            <w:r>
+              <w:rPr>
+                <w:rFonts w:ascii="Arial" w:cs="Arial" w:eastAsia="Arial" w:hAnsi="Arial"/>
+                <w:b w:val="false"/>
+                <w:bCs w:val="false"/>
+                <w:sz w:val="18"/>
+                <w:szCs w:val="18"/>
+                <w:rtl/>
+              </w:rPr>
+              <w:t xml:space="preserve">) وفيه العقود حسب النوع (</w:t>
             </w:r>
             <w:r>
               <w:rPr>
@@ -566,18 +599,18 @@
                 <w:shd w:fill="F1F3F5" w:color="auto" w:val="clear"/>
                 <w:rtl/>
               </w:rPr>
-              <w:t xml:space="preserve">‎https://&lt;IP الخادم&gt;‎</w:t>
-            </w:r>
-            <w:r>
-              <w:rPr>
-                <w:rFonts w:ascii="Arial" w:cs="Arial" w:eastAsia="Arial" w:hAnsi="Arial"/>
-                <w:b w:val="false"/>
-                <w:bCs w:val="false"/>
-                <w:sz w:val="18"/>
-                <w:szCs w:val="18"/>
-                <w:rtl/>
-              </w:rPr>
-              <w:t xml:space="preserve">، ولوحة المنصة عبر نفق SSH فقط، وشهادات من سلطة الخادم نفسه، والبريد اختياري تحفظه المنصة على الخادم. وطابعة PDF أخف (Chromium بلا واجهة)، والصورتان في ملف واحد، والوثائق في ملف منفصل، فحزمة الخادم نحو 300 ميغابايت بدل 560. وشاشة «أنواع الطلبات ودورات العمل» لمدير النظام (</w:t>
+              <w:t xml:space="preserve">‎CAP-SA05-ANB-0001‎</w:t>
+            </w:r>
+            <w:r>
+              <w:rPr>
+                <w:rFonts w:ascii="Arial" w:cs="Arial" w:eastAsia="Arial" w:hAnsi="Arial"/>
+                <w:b w:val="false"/>
+                <w:bCs w:val="false"/>
+                <w:sz w:val="18"/>
+                <w:szCs w:val="18"/>
+                <w:rtl/>
+              </w:rPr>
+              <w:t xml:space="preserve">، والتجديد </w:t>
             </w:r>
             <w:r>
               <w:rPr>
@@ -590,18 +623,86 @@
                 <w:shd w:fill="F1F3F5" w:color="auto" w:val="clear"/>
                 <w:rtl/>
               </w:rPr>
-              <w:t xml:space="preserve">‎docs/31‎</w:t>
-            </w:r>
-            <w:r>
-              <w:rPr>
-                <w:rFonts w:ascii="Arial" w:cs="Arial" w:eastAsia="Arial" w:hAnsi="Arial"/>
-                <w:b w:val="false"/>
-                <w:bCs w:val="false"/>
-                <w:sz w:val="18"/>
-                <w:szCs w:val="18"/>
-                <w:rtl/>
-              </w:rPr>
-              <w:t xml:space="preserve"> الصف 73، الجزء الأول)</w:t>
+              <w:t xml:space="preserve">‎-02‎</w:t>
+            </w:r>
+            <w:r>
+              <w:rPr>
+                <w:rFonts w:ascii="Arial" w:cs="Arial" w:eastAsia="Arial" w:hAnsi="Arial"/>
+                <w:b w:val="false"/>
+                <w:bCs w:val="false"/>
+                <w:sz w:val="18"/>
+                <w:szCs w:val="18"/>
+                <w:rtl/>
+              </w:rPr>
+              <w:t xml:space="preserve">) والمراسلات وطلبات التجديد؛ واسم البنك بالعربية والإنجليزية ورمزه الثلاثي إلزامية (الصف 75). </w:t>
+            </w:r>
+            <w:r>
+              <w:rPr>
+                <w:rFonts w:ascii="Arial" w:cs="Arial" w:eastAsia="Arial" w:hAnsi="Arial"/>
+                <w:b/>
+                <w:bCs/>
+                <w:sz w:val="18"/>
+                <w:szCs w:val="18"/>
+                <w:rtl/>
+              </w:rPr>
+              <w:t xml:space="preserve">منتجات البنك</w:t>
+            </w:r>
+            <w:r>
+              <w:rPr>
+                <w:rFonts w:ascii="Arial" w:cs="Arial" w:eastAsia="Arial" w:hAnsi="Arial"/>
+                <w:b w:val="false"/>
+                <w:bCs w:val="false"/>
+                <w:sz w:val="18"/>
+                <w:szCs w:val="18"/>
+                <w:rtl/>
+              </w:rPr>
+              <w:t xml:space="preserve">: ودائع وسواب وصناديق وأسهم وملكية خاصة وإدارة ثروات ومصرفية خاصة وبطاقات مسبقة الدفع، والعمولات المتفق عليها لكل منتج حسب طبيعته (مدى وفيزا وماستر والشبكة الخليجية، وتحويلات الرواتب...)، وأحجام التعامل، وملخص البيع المتقاطع للبنك (الصف 76). </w:t>
+            </w:r>
+            <w:r>
+              <w:rPr>
+                <w:rFonts w:ascii="Arial" w:cs="Arial" w:eastAsia="Arial" w:hAnsi="Arial"/>
+                <w:b/>
+                <w:bCs/>
+                <w:sz w:val="18"/>
+                <w:szCs w:val="18"/>
+                <w:rtl/>
+              </w:rPr>
+              <w:t xml:space="preserve">رقم الطلب لدى الشركة</w:t>
+            </w:r>
+            <w:r>
+              <w:rPr>
+                <w:rFonts w:ascii="Arial" w:cs="Arial" w:eastAsia="Arial" w:hAnsi="Arial"/>
+                <w:b w:val="false"/>
+                <w:bCs w:val="false"/>
+                <w:sz w:val="18"/>
+                <w:szCs w:val="18"/>
+                <w:rtl/>
+              </w:rPr>
+              <w:t xml:space="preserve"> عند إصدار البنك (</w:t>
+            </w:r>
+            <w:r>
+              <w:rPr>
+                <w:rFonts w:ascii="Courier New" w:cs="Courier New" w:eastAsia="Courier New" w:hAnsi="Courier New"/>
+                <w:b w:val="false"/>
+                <w:bCs w:val="false"/>
+                <w:color w:val="1F2937"/>
+                <w:sz w:val="16"/>
+                <w:szCs w:val="16"/>
+                <w:shd w:fill="F1F3F5" w:color="auto" w:val="clear"/>
+                <w:rtl/>
+              </w:rPr>
+              <w:t xml:space="preserve">‎SA05-IMP-00001‎</w:t>
+            </w:r>
+            <w:r>
+              <w:rPr>
+                <w:rFonts w:ascii="Arial" w:cs="Arial" w:eastAsia="Arial" w:hAnsi="Arial"/>
+                <w:b w:val="false"/>
+                <w:bCs w:val="false"/>
+                <w:sz w:val="18"/>
+                <w:szCs w:val="18"/>
+                <w:rtl/>
+              </w:rPr>
+              <w:t xml:space="preserve">) ومراجع الطلب المتعددة (الصف 72)، وشاشة لكل فئة من الطلبات (الصف 73)</w:t>
             </w:r>
           </w:p>
         </w:tc>
@@ -612,7 +713,7 @@
         </w:trPr>
         <w:tc>
           <w:tcPr>
-            <w:tcW w:type="dxa" w:w="1972"/>
+            <w:tcW w:type="dxa" w:w="1918"/>
             <w:tcBorders>
               <w:top w:val="single" w:color="BFC9D6" w:sz="4"/>
               <w:left w:val="single" w:color="BFC9D6" w:sz="4"/>
@@ -643,13 +744,13 @@
                 <w:szCs w:val="18"/>
                 <w:rtl/>
               </w:rPr>
-              <w:t xml:space="preserve">1.0.6</w:t>
+              <w:t xml:space="preserve">1.0.7</w:t>
             </w:r>
           </w:p>
         </w:tc>
         <w:tc>
           <w:tcPr>
-            <w:tcW w:type="dxa" w:w="2818"/>
+            <w:tcW w:type="dxa" w:w="2740"/>
             <w:tcBorders>
               <w:top w:val="single" w:color="BFC9D6" w:sz="4"/>
               <w:left w:val="single" w:color="BFC9D6" w:sz="4"/>
@@ -686,7 +787,7 @@
         </w:tc>
         <w:tc>
           <w:tcPr>
-            <w:tcW w:type="dxa" w:w="5074"/>
+            <w:tcW w:type="dxa" w:w="5206"/>
             <w:tcBorders>
               <w:top w:val="single" w:color="BFC9D6" w:sz="4"/>
               <w:left w:val="single" w:color="BFC9D6" w:sz="4"/>
@@ -717,7 +818,7 @@
                 <w:szCs w:val="18"/>
                 <w:rtl/>
               </w:rPr>
-              <w:t xml:space="preserve">في الشاشات الإنجليزية يظهر كل رمز من الخادم كلمة: الحالات، وأدوار البنوك، وأنواع الحدود، وأنماط التوزيع وغيرها، والاختصارات كما هي. وخطوط المنتج في الحدود باسم المنتج (</w:t>
+              <w:t xml:space="preserve">التجربة الخاصة بعنوان IP دون نطاق (</w:t>
             </w:r>
             <w:r>
               <w:rPr>
@@ -730,6 +831,54 @@
                 <w:shd w:fill="F1F3F5" w:color="auto" w:val="clear"/>
                 <w:rtl/>
               </w:rPr>
+              <w:t xml:space="preserve">‎docs/62‎</w:t>
+            </w:r>
+            <w:r>
+              <w:rPr>
+                <w:rFonts w:ascii="Arial" w:cs="Arial" w:eastAsia="Arial" w:hAnsi="Arial"/>
+                <w:b w:val="false"/>
+                <w:bCs w:val="false"/>
+                <w:sz w:val="18"/>
+                <w:szCs w:val="18"/>
+                <w:rtl/>
+              </w:rPr>
+              <w:t xml:space="preserve">): بوابة الشركة التجريبية على </w:t>
+            </w:r>
+            <w:r>
+              <w:rPr>
+                <w:rFonts w:ascii="Courier New" w:cs="Courier New" w:eastAsia="Courier New" w:hAnsi="Courier New"/>
+                <w:b w:val="false"/>
+                <w:bCs w:val="false"/>
+                <w:color w:val="1F2937"/>
+                <w:sz w:val="16"/>
+                <w:szCs w:val="16"/>
+                <w:shd w:fill="F1F3F5" w:color="auto" w:val="clear"/>
+                <w:rtl/>
+              </w:rPr>
+              <w:t xml:space="preserve">‎https://&lt;IP الخادم&gt;‎</w:t>
+            </w:r>
+            <w:r>
+              <w:rPr>
+                <w:rFonts w:ascii="Arial" w:cs="Arial" w:eastAsia="Arial" w:hAnsi="Arial"/>
+                <w:b w:val="false"/>
+                <w:bCs w:val="false"/>
+                <w:sz w:val="18"/>
+                <w:szCs w:val="18"/>
+                <w:rtl/>
+              </w:rPr>
+              <w:t xml:space="preserve">، ولوحة المنصة عبر نفق SSH فقط، وشهادات من سلطة الخادم نفسه، والبريد اختياري تحفظه المنصة على الخادم. وطابعة PDF أخف (Chromium بلا واجهة)، والصورتان في ملف واحد، والوثائق في ملف منفصل، فحزمة الخادم نحو 300 ميغابايت بدل 560. وشاشة «أنواع الطلبات ودورات العمل» لمدير النظام (</w:t>
+            </w:r>
+            <w:r>
+              <w:rPr>
+                <w:rFonts w:ascii="Courier New" w:cs="Courier New" w:eastAsia="Courier New" w:hAnsi="Courier New"/>
+                <w:b w:val="false"/>
+                <w:bCs w:val="false"/>
+                <w:color w:val="1F2937"/>
+                <w:sz w:val="16"/>
+                <w:szCs w:val="16"/>
+                <w:shd w:fill="F1F3F5" w:color="auto" w:val="clear"/>
+                <w:rtl/>
+              </w:rPr>
               <w:t xml:space="preserve">‎docs/31‎</w:t>
             </w:r>
             <w:r>
@@ -741,7 +890,7 @@
                 <w:szCs w:val="18"/>
                 <w:rtl/>
               </w:rPr>
-              <w:t xml:space="preserve"> الصف 71)</w:t>
+              <w:t xml:space="preserve"> الصف 73، الجزء الأول)</w:t>
             </w:r>
           </w:p>
         </w:tc>
@@ -752,7 +901,7 @@
         </w:trPr>
         <w:tc>
           <w:tcPr>
-            <w:tcW w:type="dxa" w:w="1972"/>
+            <w:tcW w:type="dxa" w:w="1918"/>
             <w:tcBorders>
               <w:top w:val="single" w:color="BFC9D6" w:sz="4"/>
               <w:left w:val="single" w:color="BFC9D6" w:sz="4"/>
@@ -782,13 +931,13 @@
                 <w:szCs w:val="18"/>
                 <w:rtl/>
               </w:rPr>
-              <w:t xml:space="preserve">1.0.5</w:t>
+              <w:t xml:space="preserve">1.0.6</w:t>
             </w:r>
           </w:p>
         </w:tc>
         <w:tc>
           <w:tcPr>
-            <w:tcW w:type="dxa" w:w="2818"/>
+            <w:tcW w:type="dxa" w:w="2740"/>
             <w:tcBorders>
               <w:top w:val="single" w:color="BFC9D6" w:sz="4"/>
               <w:left w:val="single" w:color="BFC9D6" w:sz="4"/>
@@ -824,7 +973,7 @@
         </w:tc>
         <w:tc>
           <w:tcPr>
-            <w:tcW w:type="dxa" w:w="5074"/>
+            <w:tcW w:type="dxa" w:w="5206"/>
             <w:tcBorders>
               <w:top w:val="single" w:color="BFC9D6" w:sz="4"/>
               <w:left w:val="single" w:color="BFC9D6" w:sz="4"/>
@@ -854,7 +1003,7 @@
                 <w:szCs w:val="18"/>
                 <w:rtl/>
               </w:rPr>
-              <w:t xml:space="preserve">شاشة الشروط بالإنجليزية: قيم القوائم والرسوم كلمات إنجليزية بدل الرموز، وعناوين مربعات النص بحجم باقي العناوين (</w:t>
+              <w:t xml:space="preserve">في الشاشات الإنجليزية يظهر كل رمز من الخادم كلمة: الحالات، وأدوار البنوك، وأنواع الحدود، وأنماط التوزيع وغيرها، والاختصارات كما هي. وخطوط المنتج في الحدود باسم المنتج (</w:t>
             </w:r>
             <w:r>
               <w:rPr>
@@ -867,18 +1016,18 @@
                 <w:shd w:fill="F1F3F5" w:color="auto" w:val="clear"/>
                 <w:rtl/>
               </w:rPr>
-              <w:t xml:space="preserve">‎docs/59‎</w:t>
-            </w:r>
-            <w:r>
-              <w:rPr>
-                <w:rFonts w:ascii="Arial" w:cs="Arial" w:eastAsia="Arial" w:hAnsi="Arial"/>
-                <w:b w:val="false"/>
-                <w:bCs w:val="false"/>
-                <w:sz w:val="18"/>
-                <w:szCs w:val="18"/>
-                <w:rtl/>
-              </w:rPr>
-              <w:t xml:space="preserve"> §4)</w:t>
+              <w:t xml:space="preserve">‎docs/31‎</w:t>
+            </w:r>
+            <w:r>
+              <w:rPr>
+                <w:rFonts w:ascii="Arial" w:cs="Arial" w:eastAsia="Arial" w:hAnsi="Arial"/>
+                <w:b w:val="false"/>
+                <w:bCs w:val="false"/>
+                <w:sz w:val="18"/>
+                <w:szCs w:val="18"/>
+                <w:rtl/>
+              </w:rPr>
+              <w:t xml:space="preserve"> الصف 71)</w:t>
             </w:r>
           </w:p>
         </w:tc>
@@ -889,7 +1038,7 @@
         </w:trPr>
         <w:tc>
           <w:tcPr>
-            <w:tcW w:type="dxa" w:w="1972"/>
+            <w:tcW w:type="dxa" w:w="1918"/>
             <w:tcBorders>
               <w:top w:val="single" w:color="BFC9D6" w:sz="4"/>
               <w:left w:val="single" w:color="BFC9D6" w:sz="4"/>
@@ -920,13 +1069,13 @@
                 <w:szCs w:val="18"/>
                 <w:rtl/>
               </w:rPr>
-              <w:t xml:space="preserve">1.0.4</w:t>
+              <w:t xml:space="preserve">1.0.5</w:t>
             </w:r>
           </w:p>
         </w:tc>
         <w:tc>
           <w:tcPr>
-            <w:tcW w:type="dxa" w:w="2818"/>
+            <w:tcW w:type="dxa" w:w="2740"/>
             <w:tcBorders>
               <w:top w:val="single" w:color="BFC9D6" w:sz="4"/>
               <w:left w:val="single" w:color="BFC9D6" w:sz="4"/>
@@ -963,7 +1112,7 @@
         </w:tc>
         <w:tc>
           <w:tcPr>
-            <w:tcW w:type="dxa" w:w="5074"/>
+            <w:tcW w:type="dxa" w:w="5206"/>
             <w:tcBorders>
               <w:top w:val="single" w:color="BFC9D6" w:sz="4"/>
               <w:left w:val="single" w:color="BFC9D6" w:sz="4"/>
@@ -994,7 +1143,7 @@
                 <w:szCs w:val="18"/>
                 <w:rtl/>
               </w:rPr>
-              <w:t xml:space="preserve">تصنيف البضاعة باسمه من الكتالوج في الشاشة والمطبوع، والإنجليزية لغة افتراضية للشاشات والمطبوعات والبريد، والعربية خيار يحفظه المستخدم (</w:t>
+              <w:t xml:space="preserve">شاشة الشروط بالإنجليزية: قيم القوائم والرسوم كلمات إنجليزية بدل الرموز، وعناوين مربعات النص بحجم باقي العناوين (</w:t>
             </w:r>
             <w:r>
               <w:rPr>
@@ -1007,18 +1156,18 @@
                 <w:shd w:fill="F1F3F5" w:color="auto" w:val="clear"/>
                 <w:rtl/>
               </w:rPr>
-              <w:t xml:space="preserve">‎docs/60‎</w:t>
-            </w:r>
-            <w:r>
-              <w:rPr>
-                <w:rFonts w:ascii="Arial" w:cs="Arial" w:eastAsia="Arial" w:hAnsi="Arial"/>
-                <w:b w:val="false"/>
-                <w:bCs w:val="false"/>
-                <w:sz w:val="18"/>
-                <w:szCs w:val="18"/>
-                <w:rtl/>
-              </w:rPr>
-              <w:t xml:space="preserve"> §8)</w:t>
+              <w:t xml:space="preserve">‎docs/59‎</w:t>
+            </w:r>
+            <w:r>
+              <w:rPr>
+                <w:rFonts w:ascii="Arial" w:cs="Arial" w:eastAsia="Arial" w:hAnsi="Arial"/>
+                <w:b w:val="false"/>
+                <w:bCs w:val="false"/>
+                <w:sz w:val="18"/>
+                <w:szCs w:val="18"/>
+                <w:rtl/>
+              </w:rPr>
+              <w:t xml:space="preserve"> §4)</w:t>
             </w:r>
           </w:p>
         </w:tc>
@@ -1029,7 +1178,7 @@
         </w:trPr>
         <w:tc>
           <w:tcPr>
-            <w:tcW w:type="dxa" w:w="1972"/>
+            <w:tcW w:type="dxa" w:w="1918"/>
             <w:tcBorders>
               <w:top w:val="single" w:color="BFC9D6" w:sz="4"/>
               <w:left w:val="single" w:color="BFC9D6" w:sz="4"/>
@@ -1059,13 +1208,13 @@
                 <w:szCs w:val="18"/>
                 <w:rtl/>
               </w:rPr>
-              <w:t xml:space="preserve">1.0.3</w:t>
+              <w:t xml:space="preserve">1.0.4</w:t>
             </w:r>
           </w:p>
         </w:tc>
         <w:tc>
           <w:tcPr>
-            <w:tcW w:type="dxa" w:w="2818"/>
+            <w:tcW w:type="dxa" w:w="2740"/>
             <w:tcBorders>
               <w:top w:val="single" w:color="BFC9D6" w:sz="4"/>
               <w:left w:val="single" w:color="BFC9D6" w:sz="4"/>
@@ -1101,7 +1250,7 @@
         </w:tc>
         <w:tc>
           <w:tcPr>
-            <w:tcW w:type="dxa" w:w="5074"/>
+            <w:tcW w:type="dxa" w:w="5206"/>
             <w:tcBorders>
               <w:top w:val="single" w:color="BFC9D6" w:sz="4"/>
               <w:left w:val="single" w:color="BFC9D6" w:sz="4"/>
@@ -1131,7 +1280,7 @@
                 <w:szCs w:val="18"/>
                 <w:rtl/>
               </w:rPr>
-              <w:t xml:space="preserve">شروط الاعتماد برمز حقل سويفت MT700 بدل مراجع UCP في الشاشة والمطبوع، والقيم بالعربية، وكل حقول MT700 في القاموس، منها 47A و44A و44B و40A و58a. ولا أيام تأجيل لاعتماد الاطلاع (</w:t>
+              <w:t xml:space="preserve">تصنيف البضاعة باسمه من الكتالوج في الشاشة والمطبوع، والإنجليزية لغة افتراضية للشاشات والمطبوعات والبريد، والعربية خيار يحفظه المستخدم (</w:t>
             </w:r>
             <w:r>
               <w:rPr>
@@ -1155,7 +1304,7 @@
                 <w:szCs w:val="18"/>
                 <w:rtl/>
               </w:rPr>
-              <w:t xml:space="preserve"> §6 و§7)</w:t>
+              <w:t xml:space="preserve"> §8)</w:t>
             </w:r>
           </w:p>
         </w:tc>
@@ -1166,7 +1315,7 @@
         </w:trPr>
         <w:tc>
           <w:tcPr>
-            <w:tcW w:type="dxa" w:w="1972"/>
+            <w:tcW w:type="dxa" w:w="1918"/>
             <w:tcBorders>
               <w:top w:val="single" w:color="BFC9D6" w:sz="4"/>
               <w:left w:val="single" w:color="BFC9D6" w:sz="4"/>
@@ -1197,13 +1346,13 @@
                 <w:szCs w:val="18"/>
                 <w:rtl/>
               </w:rPr>
-              <w:t xml:space="preserve">1.0.2</w:t>
+              <w:t xml:space="preserve">1.0.3</w:t>
             </w:r>
           </w:p>
         </w:tc>
         <w:tc>
           <w:tcPr>
-            <w:tcW w:type="dxa" w:w="2818"/>
+            <w:tcW w:type="dxa" w:w="2740"/>
             <w:tcBorders>
               <w:top w:val="single" w:color="BFC9D6" w:sz="4"/>
               <w:left w:val="single" w:color="BFC9D6" w:sz="4"/>
@@ -1240,7 +1389,7 @@
         </w:tc>
         <w:tc>
           <w:tcPr>
-            <w:tcW w:type="dxa" w:w="5074"/>
+            <w:tcW w:type="dxa" w:w="5206"/>
             <w:tcBorders>
               <w:top w:val="single" w:color="BFC9D6" w:sz="4"/>
               <w:left w:val="single" w:color="BFC9D6" w:sz="4"/>
@@ -1271,7 +1420,7 @@
                 <w:szCs w:val="18"/>
                 <w:rtl/>
               </w:rPr>
-              <w:t xml:space="preserve">مراجع UCP 600 بجانب حقول شروط الاعتماد ومستنداته، وفحوص المواد 28 و29 و31-32 و19-24 (</w:t>
+              <w:t xml:space="preserve">شروط الاعتماد برمز حقل سويفت MT700 بدل مراجع UCP في الشاشة والمطبوع، والقيم بالعربية، وكل حقول MT700 في القاموس، منها 47A و44A و44B و40A و58a. ولا أيام تأجيل لاعتماد الاطلاع (</w:t>
             </w:r>
             <w:r>
               <w:rPr>
@@ -1295,116 +1444,7 @@
                 <w:szCs w:val="18"/>
                 <w:rtl/>
               </w:rPr>
-              <w:t xml:space="preserve">). ودعم الخادم الواحد للتجربة (</w:t>
-            </w:r>
-            <w:r>
-              <w:rPr>
-                <w:rFonts w:ascii="Courier New" w:cs="Courier New" w:eastAsia="Courier New" w:hAnsi="Courier New"/>
-                <w:b w:val="false"/>
-                <w:bCs w:val="false"/>
-                <w:color w:val="1F2937"/>
-                <w:sz w:val="16"/>
-                <w:szCs w:val="16"/>
-                <w:shd w:fill="F1F3F5" w:color="auto" w:val="clear"/>
-                <w:rtl/>
-              </w:rPr>
-              <w:t xml:space="preserve">‎docs/58‎</w:t>
-            </w:r>
-            <w:r>
-              <w:rPr>
-                <w:rFonts w:ascii="Arial" w:cs="Arial" w:eastAsia="Arial" w:hAnsi="Arial"/>
-                <w:b w:val="false"/>
-                <w:bCs w:val="false"/>
-                <w:sz w:val="18"/>
-                <w:szCs w:val="18"/>
-                <w:rtl/>
-              </w:rPr>
-              <w:t xml:space="preserve">): </w:t>
-            </w:r>
-            <w:r>
-              <w:rPr>
-                <w:rFonts w:ascii="Courier New" w:cs="Courier New" w:eastAsia="Courier New" w:hAnsi="Courier New"/>
-                <w:b w:val="false"/>
-                <w:bCs w:val="false"/>
-                <w:color w:val="1F2937"/>
-                <w:sz w:val="16"/>
-                <w:szCs w:val="16"/>
-                <w:shd w:fill="F1F3F5" w:color="auto" w:val="clear"/>
-                <w:rtl/>
-              </w:rPr>
-              <w:t xml:space="preserve">‎DB_ADDRESS‎</w:t>
-            </w:r>
-            <w:r>
-              <w:rPr>
-                <w:rFonts w:ascii="Arial" w:cs="Arial" w:eastAsia="Arial" w:hAnsi="Arial"/>
-                <w:b w:val="false"/>
-                <w:bCs w:val="false"/>
-                <w:sz w:val="18"/>
-                <w:szCs w:val="18"/>
-                <w:rtl/>
-              </w:rPr>
-              <w:t xml:space="preserve"> في </w:t>
-            </w:r>
-            <w:r>
-              <w:rPr>
-                <w:rFonts w:ascii="Courier New" w:cs="Courier New" w:eastAsia="Courier New" w:hAnsi="Courier New"/>
-                <w:b w:val="false"/>
-                <w:bCs w:val="false"/>
-                <w:color w:val="1F2937"/>
-                <w:sz w:val="16"/>
-                <w:szCs w:val="16"/>
-                <w:shd w:fill="F1F3F5" w:color="auto" w:val="clear"/>
-                <w:rtl/>
-              </w:rPr>
-              <w:t xml:space="preserve">‎site.conf‎</w:t>
-            </w:r>
-            <w:r>
-              <w:rPr>
-                <w:rFonts w:ascii="Arial" w:cs="Arial" w:eastAsia="Arial" w:hAnsi="Arial"/>
-                <w:b w:val="false"/>
-                <w:bCs w:val="false"/>
-                <w:sz w:val="18"/>
-                <w:szCs w:val="18"/>
-                <w:rtl/>
-              </w:rPr>
-              <w:t xml:space="preserve">، و</w:t>
-            </w:r>
-            <w:r>
-              <w:rPr>
-                <w:rFonts w:ascii="Courier New" w:cs="Courier New" w:eastAsia="Courier New" w:hAnsi="Courier New"/>
-                <w:b w:val="false"/>
-                <w:bCs w:val="false"/>
-                <w:color w:val="1F2937"/>
-                <w:sz w:val="16"/>
-                <w:szCs w:val="16"/>
-                <w:shd w:fill="F1F3F5" w:color="auto" w:val="clear"/>
-                <w:rtl/>
-              </w:rPr>
-              <w:t xml:space="preserve">‎DB_ON_THIS_HOST=1‎</w:t>
-            </w:r>
-            <w:r>
-              <w:rPr>
-                <w:rFonts w:ascii="Arial" w:cs="Arial" w:eastAsia="Arial" w:hAnsi="Arial"/>
-                <w:b w:val="false"/>
-                <w:bCs w:val="false"/>
-                <w:sz w:val="18"/>
-                <w:szCs w:val="18"/>
-                <w:rtl/>
-              </w:rPr>
-              <w:t xml:space="preserve"> في </w:t>
-            </w:r>
-            <w:r>
-              <w:rPr>
-                <w:rFonts w:ascii="Courier New" w:cs="Courier New" w:eastAsia="Courier New" w:hAnsi="Courier New"/>
-                <w:b w:val="false"/>
-                <w:bCs w:val="false"/>
-                <w:color w:val="1F2937"/>
-                <w:sz w:val="16"/>
-                <w:szCs w:val="16"/>
-                <w:shd w:fill="F1F3F5" w:color="auto" w:val="clear"/>
-                <w:rtl/>
-              </w:rPr>
-              <w:t xml:space="preserve">‎ufw.sh‎</w:t>
+              <w:t xml:space="preserve"> §6 و§7)</w:t>
             </w:r>
           </w:p>
         </w:tc>
@@ -1415,7 +1455,7 @@
         </w:trPr>
         <w:tc>
           <w:tcPr>
-            <w:tcW w:type="dxa" w:w="1972"/>
+            <w:tcW w:type="dxa" w:w="1918"/>
             <w:tcBorders>
               <w:top w:val="single" w:color="BFC9D6" w:sz="4"/>
               <w:left w:val="single" w:color="BFC9D6" w:sz="4"/>
@@ -1445,13 +1485,13 @@
                 <w:szCs w:val="18"/>
                 <w:rtl/>
               </w:rPr>
-              <w:t xml:space="preserve">1.0.1</w:t>
+              <w:t xml:space="preserve">1.0.2</w:t>
             </w:r>
           </w:p>
         </w:tc>
         <w:tc>
           <w:tcPr>
-            <w:tcW w:type="dxa" w:w="2818"/>
+            <w:tcW w:type="dxa" w:w="2740"/>
             <w:tcBorders>
               <w:top w:val="single" w:color="BFC9D6" w:sz="4"/>
               <w:left w:val="single" w:color="BFC9D6" w:sz="4"/>
@@ -1481,13 +1521,13 @@
                 <w:szCs w:val="18"/>
                 <w:rtl/>
               </w:rPr>
-              <w:t xml:space="preserve">2026-10-25</w:t>
+              <w:t xml:space="preserve">2026-10-26</w:t>
             </w:r>
           </w:p>
         </w:tc>
         <w:tc>
           <w:tcPr>
-            <w:tcW w:type="dxa" w:w="5074"/>
+            <w:tcW w:type="dxa" w:w="5206"/>
             <w:tcBorders>
               <w:top w:val="single" w:color="BFC9D6" w:sz="4"/>
               <w:left w:val="single" w:color="BFC9D6" w:sz="4"/>
@@ -1517,7 +1557,7 @@
                 <w:szCs w:val="18"/>
                 <w:rtl/>
               </w:rPr>
-              <w:t xml:space="preserve">تقرير التقييم الائتماني المطبوع بغلافه وصفحاته الداخلية على الهوية (</w:t>
+              <w:t xml:space="preserve">مراجع UCP 600 بجانب حقول شروط الاعتماد ومستنداته، وفحوص المواد 28 و29 و31-32 و19-24 (</w:t>
             </w:r>
             <w:r>
               <w:rPr>
@@ -1530,18 +1570,127 @@
                 <w:shd w:fill="F1F3F5" w:color="auto" w:val="clear"/>
                 <w:rtl/>
               </w:rPr>
-              <w:t xml:space="preserve">‎docs/56‎</w:t>
-            </w:r>
-            <w:r>
-              <w:rPr>
-                <w:rFonts w:ascii="Arial" w:cs="Arial" w:eastAsia="Arial" w:hAnsi="Arial"/>
-                <w:b w:val="false"/>
-                <w:bCs w:val="false"/>
-                <w:sz w:val="18"/>
-                <w:szCs w:val="18"/>
-                <w:rtl/>
-              </w:rPr>
-              <w:t xml:space="preserve"> §7)، برابطي «طباعة التقرير» و«تنزيل PDF» في شاشة التقييم. ودليل التثبيت صار جزءًا من كل إصدار باسم ثابت</w:t>
+              <w:t xml:space="preserve">‎docs/60‎</w:t>
+            </w:r>
+            <w:r>
+              <w:rPr>
+                <w:rFonts w:ascii="Arial" w:cs="Arial" w:eastAsia="Arial" w:hAnsi="Arial"/>
+                <w:b w:val="false"/>
+                <w:bCs w:val="false"/>
+                <w:sz w:val="18"/>
+                <w:szCs w:val="18"/>
+                <w:rtl/>
+              </w:rPr>
+              <w:t xml:space="preserve">). ودعم الخادم الواحد للتجربة (</w:t>
+            </w:r>
+            <w:r>
+              <w:rPr>
+                <w:rFonts w:ascii="Courier New" w:cs="Courier New" w:eastAsia="Courier New" w:hAnsi="Courier New"/>
+                <w:b w:val="false"/>
+                <w:bCs w:val="false"/>
+                <w:color w:val="1F2937"/>
+                <w:sz w:val="16"/>
+                <w:szCs w:val="16"/>
+                <w:shd w:fill="F1F3F5" w:color="auto" w:val="clear"/>
+                <w:rtl/>
+              </w:rPr>
+              <w:t xml:space="preserve">‎docs/58‎</w:t>
+            </w:r>
+            <w:r>
+              <w:rPr>
+                <w:rFonts w:ascii="Arial" w:cs="Arial" w:eastAsia="Arial" w:hAnsi="Arial"/>
+                <w:b w:val="false"/>
+                <w:bCs w:val="false"/>
+                <w:sz w:val="18"/>
+                <w:szCs w:val="18"/>
+                <w:rtl/>
+              </w:rPr>
+              <w:t xml:space="preserve">): </w:t>
+            </w:r>
+            <w:r>
+              <w:rPr>
+                <w:rFonts w:ascii="Courier New" w:cs="Courier New" w:eastAsia="Courier New" w:hAnsi="Courier New"/>
+                <w:b w:val="false"/>
+                <w:bCs w:val="false"/>
+                <w:color w:val="1F2937"/>
+                <w:sz w:val="16"/>
+                <w:szCs w:val="16"/>
+                <w:shd w:fill="F1F3F5" w:color="auto" w:val="clear"/>
+                <w:rtl/>
+              </w:rPr>
+              <w:t xml:space="preserve">‎DB_ADDRESS‎</w:t>
+            </w:r>
+            <w:r>
+              <w:rPr>
+                <w:rFonts w:ascii="Arial" w:cs="Arial" w:eastAsia="Arial" w:hAnsi="Arial"/>
+                <w:b w:val="false"/>
+                <w:bCs w:val="false"/>
+                <w:sz w:val="18"/>
+                <w:szCs w:val="18"/>
+                <w:rtl/>
+              </w:rPr>
+              <w:t xml:space="preserve"> في </w:t>
+            </w:r>
+            <w:r>
+              <w:rPr>
+                <w:rFonts w:ascii="Courier New" w:cs="Courier New" w:eastAsia="Courier New" w:hAnsi="Courier New"/>
+                <w:b w:val="false"/>
+                <w:bCs w:val="false"/>
+                <w:color w:val="1F2937"/>
+                <w:sz w:val="16"/>
+                <w:szCs w:val="16"/>
+                <w:shd w:fill="F1F3F5" w:color="auto" w:val="clear"/>
+                <w:rtl/>
+              </w:rPr>
+              <w:t xml:space="preserve">‎site.conf‎</w:t>
+            </w:r>
+            <w:r>
+              <w:rPr>
+                <w:rFonts w:ascii="Arial" w:cs="Arial" w:eastAsia="Arial" w:hAnsi="Arial"/>
+                <w:b w:val="false"/>
+                <w:bCs w:val="false"/>
+                <w:sz w:val="18"/>
+                <w:szCs w:val="18"/>
+                <w:rtl/>
+              </w:rPr>
+              <w:t xml:space="preserve">، و</w:t>
+            </w:r>
+            <w:r>
+              <w:rPr>
+                <w:rFonts w:ascii="Courier New" w:cs="Courier New" w:eastAsia="Courier New" w:hAnsi="Courier New"/>
+                <w:b w:val="false"/>
+                <w:bCs w:val="false"/>
+                <w:color w:val="1F2937"/>
+                <w:sz w:val="16"/>
+                <w:szCs w:val="16"/>
+                <w:shd w:fill="F1F3F5" w:color="auto" w:val="clear"/>
+                <w:rtl/>
+              </w:rPr>
+              <w:t xml:space="preserve">‎DB_ON_THIS_HOST=1‎</w:t>
+            </w:r>
+            <w:r>
+              <w:rPr>
+                <w:rFonts w:ascii="Arial" w:cs="Arial" w:eastAsia="Arial" w:hAnsi="Arial"/>
+                <w:b w:val="false"/>
+                <w:bCs w:val="false"/>
+                <w:sz w:val="18"/>
+                <w:szCs w:val="18"/>
+                <w:rtl/>
+              </w:rPr>
+              <w:t xml:space="preserve"> في </w:t>
+            </w:r>
+            <w:r>
+              <w:rPr>
+                <w:rFonts w:ascii="Courier New" w:cs="Courier New" w:eastAsia="Courier New" w:hAnsi="Courier New"/>
+                <w:b w:val="false"/>
+                <w:bCs w:val="false"/>
+                <w:color w:val="1F2937"/>
+                <w:sz w:val="16"/>
+                <w:szCs w:val="16"/>
+                <w:shd w:fill="F1F3F5" w:color="auto" w:val="clear"/>
+                <w:rtl/>
+              </w:rPr>
+              <w:t xml:space="preserve">‎ufw.sh‎</w:t>
             </w:r>
           </w:p>
         </w:tc>
@@ -1552,7 +1701,7 @@
         </w:trPr>
         <w:tc>
           <w:tcPr>
-            <w:tcW w:type="dxa" w:w="1972"/>
+            <w:tcW w:type="dxa" w:w="1918"/>
             <w:tcBorders>
               <w:top w:val="single" w:color="BFC9D6" w:sz="4"/>
               <w:left w:val="single" w:color="BFC9D6" w:sz="4"/>
@@ -1583,13 +1732,13 @@
                 <w:szCs w:val="18"/>
                 <w:rtl/>
               </w:rPr>
-              <w:t xml:space="preserve">1.0.0</w:t>
+              <w:t xml:space="preserve">1.0.1</w:t>
             </w:r>
           </w:p>
         </w:tc>
         <w:tc>
           <w:tcPr>
-            <w:tcW w:type="dxa" w:w="2818"/>
+            <w:tcW w:type="dxa" w:w="2740"/>
             <w:tcBorders>
               <w:top w:val="single" w:color="BFC9D6" w:sz="4"/>
               <w:left w:val="single" w:color="BFC9D6" w:sz="4"/>
@@ -1626,7 +1775,7 @@
         </w:tc>
         <w:tc>
           <w:tcPr>
-            <w:tcW w:type="dxa" w:w="5074"/>
+            <w:tcW w:type="dxa" w:w="5206"/>
             <w:tcBorders>
               <w:top w:val="single" w:color="BFC9D6" w:sz="4"/>
               <w:left w:val="single" w:color="BFC9D6" w:sz="4"/>
@@ -1657,6 +1806,143 @@
                 <w:szCs w:val="18"/>
                 <w:rtl/>
               </w:rPr>
+              <w:t xml:space="preserve">تقرير التقييم الائتماني المطبوع بغلافه وصفحاته الداخلية على الهوية (</w:t>
+            </w:r>
+            <w:r>
+              <w:rPr>
+                <w:rFonts w:ascii="Courier New" w:cs="Courier New" w:eastAsia="Courier New" w:hAnsi="Courier New"/>
+                <w:b w:val="false"/>
+                <w:bCs w:val="false"/>
+                <w:color w:val="1F2937"/>
+                <w:sz w:val="16"/>
+                <w:szCs w:val="16"/>
+                <w:shd w:fill="F1F3F5" w:color="auto" w:val="clear"/>
+                <w:rtl/>
+              </w:rPr>
+              <w:t xml:space="preserve">‎docs/56‎</w:t>
+            </w:r>
+            <w:r>
+              <w:rPr>
+                <w:rFonts w:ascii="Arial" w:cs="Arial" w:eastAsia="Arial" w:hAnsi="Arial"/>
+                <w:b w:val="false"/>
+                <w:bCs w:val="false"/>
+                <w:sz w:val="18"/>
+                <w:szCs w:val="18"/>
+                <w:rtl/>
+              </w:rPr>
+              <w:t xml:space="preserve"> §7)، برابطي «طباعة التقرير» و«تنزيل PDF» في شاشة التقييم. ودليل التثبيت صار جزءًا من كل إصدار باسم ثابت</w:t>
+            </w:r>
+          </w:p>
+        </w:tc>
+      </w:tr>
+      <w:tr>
+        <w:trPr>
+          <w:cantSplit/>
+        </w:trPr>
+        <w:tc>
+          <w:tcPr>
+            <w:tcW w:type="dxa" w:w="1918"/>
+            <w:tcBorders>
+              <w:top w:val="single" w:color="BFC9D6" w:sz="4"/>
+              <w:left w:val="single" w:color="BFC9D6" w:sz="4"/>
+              <w:bottom w:val="single" w:color="BFC9D6" w:sz="4"/>
+              <w:right w:val="single" w:color="BFC9D6" w:sz="4"/>
+            </w:tcBorders>
+            <w:tcMar>
+              <w:top w:type="dxa" w:w="50"/>
+              <w:left w:type="dxa" w:w="90"/>
+              <w:bottom w:type="dxa" w:w="50"/>
+              <w:right w:type="dxa" w:w="90"/>
+            </w:tcMar>
+            <w:vAlign w:val="top"/>
+          </w:tcPr>
+          <w:p>
+            <w:pPr>
+              <w:keepNext w:val="false"/>
+              <w:bidi/>
+              <w:spacing w:after="30" w:before="30" w:line="264"/>
+            </w:pPr>
+            <w:r>
+              <w:rPr>
+                <w:rFonts w:ascii="Arial" w:cs="Arial" w:eastAsia="Arial" w:hAnsi="Arial"/>
+                <w:b w:val="false"/>
+                <w:bCs w:val="false"/>
+                <w:sz w:val="18"/>
+                <w:szCs w:val="18"/>
+                <w:rtl/>
+              </w:rPr>
+              <w:t xml:space="preserve">1.0.0</w:t>
+            </w:r>
+          </w:p>
+        </w:tc>
+        <w:tc>
+          <w:tcPr>
+            <w:tcW w:type="dxa" w:w="2740"/>
+            <w:tcBorders>
+              <w:top w:val="single" w:color="BFC9D6" w:sz="4"/>
+              <w:left w:val="single" w:color="BFC9D6" w:sz="4"/>
+              <w:bottom w:val="single" w:color="BFC9D6" w:sz="4"/>
+              <w:right w:val="single" w:color="BFC9D6" w:sz="4"/>
+            </w:tcBorders>
+            <w:tcMar>
+              <w:top w:type="dxa" w:w="50"/>
+              <w:left w:type="dxa" w:w="90"/>
+              <w:bottom w:type="dxa" w:w="50"/>
+              <w:right w:type="dxa" w:w="90"/>
+            </w:tcMar>
+            <w:vAlign w:val="top"/>
+          </w:tcPr>
+          <w:p>
+            <w:pPr>
+              <w:keepNext w:val="false"/>
+              <w:bidi/>
+              <w:spacing w:after="30" w:before="30" w:line="264"/>
+            </w:pPr>
+            <w:r>
+              <w:rPr>
+                <w:rFonts w:ascii="Arial" w:cs="Arial" w:eastAsia="Arial" w:hAnsi="Arial"/>
+                <w:b w:val="false"/>
+                <w:bCs w:val="false"/>
+                <w:sz w:val="18"/>
+                <w:szCs w:val="18"/>
+                <w:rtl/>
+              </w:rPr>
+              <w:t xml:space="preserve">2026-10-25</w:t>
+            </w:r>
+          </w:p>
+        </w:tc>
+        <w:tc>
+          <w:tcPr>
+            <w:tcW w:type="dxa" w:w="5206"/>
+            <w:tcBorders>
+              <w:top w:val="single" w:color="BFC9D6" w:sz="4"/>
+              <w:left w:val="single" w:color="BFC9D6" w:sz="4"/>
+              <w:bottom w:val="single" w:color="BFC9D6" w:sz="4"/>
+              <w:right w:val="single" w:color="BFC9D6" w:sz="4"/>
+            </w:tcBorders>
+            <w:tcMar>
+              <w:top w:type="dxa" w:w="50"/>
+              <w:left w:type="dxa" w:w="90"/>
+              <w:bottom w:type="dxa" w:w="50"/>
+              <w:right w:type="dxa" w:w="90"/>
+            </w:tcMar>
+            <w:vAlign w:val="top"/>
+          </w:tcPr>
+          <w:p>
+            <w:pPr>
+              <w:keepNext w:val="false"/>
+              <w:bidi/>
+              <w:spacing w:after="30" w:before="30" w:line="264"/>
+            </w:pPr>
+            <w:r>
+              <w:rPr>
+                <w:rFonts w:ascii="Arial" w:cs="Arial" w:eastAsia="Arial" w:hAnsi="Arial"/>
+                <w:b w:val="false"/>
+                <w:bCs w:val="false"/>
+                <w:sz w:val="18"/>
+                <w:szCs w:val="18"/>
+                <w:rtl/>
+              </w:rPr>
               <w:t xml:space="preserve">الإصدار الأول: كل الوحدات، والهوية البصرية، والقائمة حسب الوحدات، والمطبوعات والبريد بالهوية</w:t>
             </w:r>
           </w:p>
@@ -1840,6 +2126,344 @@
     <w:p>
       <w:r>
         <w:br w:type="page"/>
+      </w:r>
+    </w:p>
+    <w:p>
+      <w:pPr>
+        <w:bidi/>
+        <w:spacing w:after="110" w:before="0" w:line="312"/>
+      </w:pPr>
+      <w:r>
+        <w:rPr>
+          <w:rFonts w:ascii="Arial" w:cs="Arial" w:eastAsia="Arial" w:hAnsi="Arial"/>
+          <w:b/>
+          <w:bCs/>
+          <w:sz w:val="21"/>
+          <w:szCs w:val="21"/>
+          <w:rtl/>
+        </w:rPr>
+        <w:t xml:space="preserve">الترقية من 1.0.7 إلى 1.0.8:</w:t>
+      </w:r>
+      <w:r>
+        <w:rPr>
+          <w:rFonts w:ascii="Arial" w:cs="Arial" w:eastAsia="Arial" w:hAnsi="Arial"/>
+          <w:b w:val="false"/>
+          <w:bCs w:val="false"/>
+          <w:sz w:val="21"/>
+          <w:szCs w:val="21"/>
+          <w:rtl/>
+        </w:rPr>
+        <w:t xml:space="preserve"> </w:t>
+      </w:r>
+      <w:r>
+        <w:rPr>
+          <w:rFonts w:ascii="Arial" w:cs="Arial" w:eastAsia="Arial" w:hAnsi="Arial"/>
+          <w:b/>
+          <w:bCs/>
+          <w:sz w:val="21"/>
+          <w:szCs w:val="21"/>
+          <w:rtl/>
+        </w:rPr>
+        <w:t xml:space="preserve">فيها تغيير في قاعدة البيانات</w:t>
+      </w:r>
+      <w:r>
+        <w:rPr>
+          <w:rFonts w:ascii="Arial" w:cs="Arial" w:eastAsia="Arial" w:hAnsi="Arial"/>
+          <w:b w:val="false"/>
+          <w:bCs w:val="false"/>
+          <w:sz w:val="21"/>
+          <w:szCs w:val="21"/>
+          <w:rtl/>
+        </w:rPr>
+        <w:t xml:space="preserve">: ثلاثة ترحيلات </w:t>
+      </w:r>
+      <w:r>
+        <w:rPr>
+          <w:rFonts w:ascii="Courier New" w:cs="Courier New" w:eastAsia="Courier New" w:hAnsi="Courier New"/>
+          <w:b w:val="false"/>
+          <w:bCs w:val="false"/>
+          <w:color w:val="1F2937"/>
+          <w:sz w:val="18"/>
+          <w:szCs w:val="18"/>
+          <w:shd w:fill="F1F3F5" w:color="auto" w:val="clear"/>
+          <w:rtl/>
+        </w:rPr>
+        <w:t xml:space="preserve">‎V0001‎</w:t>
+      </w:r>
+      <w:r>
+        <w:rPr>
+          <w:rFonts w:ascii="Arial" w:cs="Arial" w:eastAsia="Arial" w:hAnsi="Arial"/>
+          <w:b w:val="false"/>
+          <w:bCs w:val="false"/>
+          <w:sz w:val="21"/>
+          <w:szCs w:val="21"/>
+          <w:rtl/>
+        </w:rPr>
+        <w:t xml:space="preserve"> (رقم الطلب لدى الشركة) و</w:t>
+      </w:r>
+      <w:r>
+        <w:rPr>
+          <w:rFonts w:ascii="Courier New" w:cs="Courier New" w:eastAsia="Courier New" w:hAnsi="Courier New"/>
+          <w:b w:val="false"/>
+          <w:bCs w:val="false"/>
+          <w:color w:val="1F2937"/>
+          <w:sz w:val="18"/>
+          <w:szCs w:val="18"/>
+          <w:shd w:fill="F1F3F5" w:color="auto" w:val="clear"/>
+          <w:rtl/>
+        </w:rPr>
+        <w:t xml:space="preserve">‎V0002‎</w:t>
+      </w:r>
+      <w:r>
+        <w:rPr>
+          <w:rFonts w:ascii="Arial" w:cs="Arial" w:eastAsia="Arial" w:hAnsi="Arial"/>
+          <w:b w:val="false"/>
+          <w:bCs w:val="false"/>
+          <w:sz w:val="21"/>
+          <w:szCs w:val="21"/>
+          <w:rtl/>
+        </w:rPr>
+        <w:t xml:space="preserve"> (ملف التسهيلات، ورمز الشركة حتى ستة أحرف) و</w:t>
+      </w:r>
+      <w:r>
+        <w:rPr>
+          <w:rFonts w:ascii="Courier New" w:cs="Courier New" w:eastAsia="Courier New" w:hAnsi="Courier New"/>
+          <w:b w:val="false"/>
+          <w:bCs w:val="false"/>
+          <w:color w:val="1F2937"/>
+          <w:sz w:val="18"/>
+          <w:szCs w:val="18"/>
+          <w:shd w:fill="F1F3F5" w:color="auto" w:val="clear"/>
+          <w:rtl/>
+        </w:rPr>
+        <w:t xml:space="preserve">‎V0003‎</w:t>
+      </w:r>
+      <w:r>
+        <w:rPr>
+          <w:rFonts w:ascii="Arial" w:cs="Arial" w:eastAsia="Arial" w:hAnsi="Arial"/>
+          <w:b w:val="false"/>
+          <w:bCs w:val="false"/>
+          <w:sz w:val="21"/>
+          <w:szCs w:val="21"/>
+          <w:rtl/>
+        </w:rPr>
+        <w:t xml:space="preserve"> (أسعار منتجات البنك وأحجامها). تُنفَّذ قبل تشغيل الصورتين الجديدتين كما في </w:t>
+      </w:r>
+      <w:r>
+        <w:rPr>
+          <w:rFonts w:ascii="Courier New" w:cs="Courier New" w:eastAsia="Courier New" w:hAnsi="Courier New"/>
+          <w:b w:val="false"/>
+          <w:bCs w:val="false"/>
+          <w:color w:val="1F2937"/>
+          <w:sz w:val="18"/>
+          <w:szCs w:val="18"/>
+          <w:shd w:fill="F1F3F5" w:color="auto" w:val="clear"/>
+          <w:rtl/>
+        </w:rPr>
+        <w:t xml:space="preserve">‎docs/62‎</w:t>
+      </w:r>
+      <w:r>
+        <w:rPr>
+          <w:rFonts w:ascii="Arial" w:cs="Arial" w:eastAsia="Arial" w:hAnsi="Arial"/>
+          <w:b w:val="false"/>
+          <w:bCs w:val="false"/>
+          <w:sz w:val="21"/>
+          <w:szCs w:val="21"/>
+          <w:rtl/>
+        </w:rPr>
+        <w:t xml:space="preserve"> القسم 16.7: إيقاف التطبيق، ثم نسخة كاملة حديثة، ثم من مجلد أدوات 1.0.8 </w:t>
+      </w:r>
+      <w:r>
+        <w:rPr>
+          <w:rFonts w:ascii="Courier New" w:cs="Courier New" w:eastAsia="Courier New" w:hAnsi="Courier New"/>
+          <w:b w:val="false"/>
+          <w:bCs w:val="false"/>
+          <w:color w:val="1F2937"/>
+          <w:sz w:val="18"/>
+          <w:szCs w:val="18"/>
+          <w:shd w:fill="F1F3F5" w:color="auto" w:val="clear"/>
+          <w:rtl/>
+        </w:rPr>
+        <w:t xml:space="preserve">‎prepare_database.sh open‎</w:t>
+      </w:r>
+      <w:r>
+        <w:rPr>
+          <w:rFonts w:ascii="Arial" w:cs="Arial" w:eastAsia="Arial" w:hAnsi="Arial"/>
+          <w:b w:val="false"/>
+          <w:bCs w:val="false"/>
+          <w:sz w:val="21"/>
+          <w:szCs w:val="21"/>
+          <w:rtl/>
+        </w:rPr>
+        <w:t xml:space="preserve">، ثم </w:t>
+      </w:r>
+      <w:r>
+        <w:rPr>
+          <w:rFonts w:ascii="Courier New" w:cs="Courier New" w:eastAsia="Courier New" w:hAnsi="Courier New"/>
+          <w:b w:val="false"/>
+          <w:bCs w:val="false"/>
+          <w:color w:val="1F2937"/>
+          <w:sz w:val="18"/>
+          <w:szCs w:val="18"/>
+          <w:shd w:fill="F1F3F5" w:color="auto" w:val="clear"/>
+          <w:rtl/>
+        </w:rPr>
+        <w:t xml:space="preserve">‎migrate.sh status‎</w:t>
+      </w:r>
+      <w:r>
+        <w:rPr>
+          <w:rFonts w:ascii="Arial" w:cs="Arial" w:eastAsia="Arial" w:hAnsi="Arial"/>
+          <w:b w:val="false"/>
+          <w:bCs w:val="false"/>
+          <w:sz w:val="21"/>
+          <w:szCs w:val="21"/>
+          <w:rtl/>
+        </w:rPr>
+        <w:t xml:space="preserve"> ثم </w:t>
+      </w:r>
+      <w:r>
+        <w:rPr>
+          <w:rFonts w:ascii="Courier New" w:cs="Courier New" w:eastAsia="Courier New" w:hAnsi="Courier New"/>
+          <w:b w:val="false"/>
+          <w:bCs w:val="false"/>
+          <w:color w:val="1F2937"/>
+          <w:sz w:val="18"/>
+          <w:szCs w:val="18"/>
+          <w:shd w:fill="F1F3F5" w:color="auto" w:val="clear"/>
+          <w:rtl/>
+        </w:rPr>
+        <w:t xml:space="preserve">‎migrate.sh apply‎</w:t>
+      </w:r>
+      <w:r>
+        <w:rPr>
+          <w:rFonts w:ascii="Arial" w:cs="Arial" w:eastAsia="Arial" w:hAnsi="Arial"/>
+          <w:b w:val="false"/>
+          <w:bCs w:val="false"/>
+          <w:sz w:val="21"/>
+          <w:szCs w:val="21"/>
+          <w:rtl/>
+        </w:rPr>
+        <w:t xml:space="preserve">، ثم </w:t>
+      </w:r>
+      <w:r>
+        <w:rPr>
+          <w:rFonts w:ascii="Courier New" w:cs="Courier New" w:eastAsia="Courier New" w:hAnsi="Courier New"/>
+          <w:b w:val="false"/>
+          <w:bCs w:val="false"/>
+          <w:color w:val="1F2937"/>
+          <w:sz w:val="18"/>
+          <w:szCs w:val="18"/>
+          <w:shd w:fill="F1F3F5" w:color="auto" w:val="clear"/>
+          <w:rtl/>
+        </w:rPr>
+        <w:t xml:space="preserve">‎prepare_database.sh close‎</w:t>
+      </w:r>
+      <w:r>
+        <w:rPr>
+          <w:rFonts w:ascii="Arial" w:cs="Arial" w:eastAsia="Arial" w:hAnsi="Arial"/>
+          <w:b w:val="false"/>
+          <w:bCs w:val="false"/>
+          <w:sz w:val="21"/>
+          <w:szCs w:val="21"/>
+          <w:rtl/>
+        </w:rPr>
+        <w:t xml:space="preserve">، ثم تحميل الصورتين وتغيير الرقم في </w:t>
+      </w:r>
+      <w:r>
+        <w:rPr>
+          <w:rFonts w:ascii="Courier New" w:cs="Courier New" w:eastAsia="Courier New" w:hAnsi="Courier New"/>
+          <w:b w:val="false"/>
+          <w:bCs w:val="false"/>
+          <w:color w:val="1F2937"/>
+          <w:sz w:val="18"/>
+          <w:szCs w:val="18"/>
+          <w:shd w:fill="F1F3F5" w:color="auto" w:val="clear"/>
+          <w:rtl/>
+        </w:rPr>
+        <w:t xml:space="preserve">‎site.conf‎</w:t>
+      </w:r>
+      <w:r>
+        <w:rPr>
+          <w:rFonts w:ascii="Arial" w:cs="Arial" w:eastAsia="Arial" w:hAnsi="Arial"/>
+          <w:b w:val="false"/>
+          <w:bCs w:val="false"/>
+          <w:sz w:val="21"/>
+          <w:szCs w:val="21"/>
+          <w:rtl/>
+        </w:rPr>
+        <w:t xml:space="preserve"> و</w:t>
+      </w:r>
+      <w:r>
+        <w:rPr>
+          <w:rFonts w:ascii="Courier New" w:cs="Courier New" w:eastAsia="Courier New" w:hAnsi="Courier New"/>
+          <w:b w:val="false"/>
+          <w:bCs w:val="false"/>
+          <w:color w:val="1F2937"/>
+          <w:sz w:val="18"/>
+          <w:szCs w:val="18"/>
+          <w:shd w:fill="F1F3F5" w:color="auto" w:val="clear"/>
+          <w:rtl/>
+        </w:rPr>
+        <w:t xml:space="preserve">‎sudo docker compose up -d‎</w:t>
+      </w:r>
+      <w:r>
+        <w:rPr>
+          <w:rFonts w:ascii="Arial" w:cs="Arial" w:eastAsia="Arial" w:hAnsi="Arial"/>
+          <w:b w:val="false"/>
+          <w:bCs w:val="false"/>
+          <w:sz w:val="21"/>
+          <w:szCs w:val="21"/>
+          <w:rtl/>
+        </w:rPr>
+        <w:t xml:space="preserve">. لا تنتقل بيانات، والمراجع المكتوبة للتسهيلات القديمة لا تتغير. ومنتجات الدليل الجديدة وقائمة بنود العمولات تُضاف إلى كل مشترك تلقائيًا بمهمة ترقية الحزم. ومن يثبّت لأول مرة يتبع </w:t>
+      </w:r>
+      <w:r>
+        <w:rPr>
+          <w:rFonts w:ascii="Courier New" w:cs="Courier New" w:eastAsia="Courier New" w:hAnsi="Courier New"/>
+          <w:b w:val="false"/>
+          <w:bCs w:val="false"/>
+          <w:color w:val="1F2937"/>
+          <w:sz w:val="18"/>
+          <w:szCs w:val="18"/>
+          <w:shd w:fill="F1F3F5" w:color="auto" w:val="clear"/>
+          <w:rtl/>
+        </w:rPr>
+        <w:t xml:space="preserve">‎docs/62‎</w:t>
+      </w:r>
+      <w:r>
+        <w:rPr>
+          <w:rFonts w:ascii="Arial" w:cs="Arial" w:eastAsia="Arial" w:hAnsi="Arial"/>
+          <w:b w:val="false"/>
+          <w:bCs w:val="false"/>
+          <w:sz w:val="21"/>
+          <w:szCs w:val="21"/>
+          <w:rtl/>
+        </w:rPr>
+        <w:t xml:space="preserve"> كما هو، فيبني </w:t>
+      </w:r>
+      <w:r>
+        <w:rPr>
+          <w:rFonts w:ascii="Courier New" w:cs="Courier New" w:eastAsia="Courier New" w:hAnsi="Courier New"/>
+          <w:b w:val="false"/>
+          <w:bCs w:val="false"/>
+          <w:color w:val="1F2937"/>
+          <w:sz w:val="18"/>
+          <w:szCs w:val="18"/>
+          <w:shd w:fill="F1F3F5" w:color="auto" w:val="clear"/>
+          <w:rtl/>
+        </w:rPr>
+        <w:t xml:space="preserve">‎deploy.sh‎</w:t>
+      </w:r>
+      <w:r>
+        <w:rPr>
+          <w:rFonts w:ascii="Arial" w:cs="Arial" w:eastAsia="Arial" w:hAnsi="Arial"/>
+          <w:b w:val="false"/>
+          <w:bCs w:val="false"/>
+          <w:sz w:val="21"/>
+          <w:szCs w:val="21"/>
+          <w:rtl/>
+        </w:rPr>
+        <w:t xml:space="preserve"> القاعدة كاملة بلا ترحيل.</w:t>
       </w:r>
     </w:p>
     <w:p>
@@ -3291,7 +3915,7 @@
           <w:shd w:fill="F1F3F5" w:color="auto" w:val="clear"/>
           <w:rtl/>
         </w:rPr>
-        <w:t xml:space="preserve">‎bankfas-v1.0.7‎</w:t>
+        <w:t xml:space="preserve">‎bankfas-v1.0.8‎</w:t>
       </w:r>
       <w:r>
         <w:rPr>
@@ -3442,7 +4066,7 @@
                 <w:shd w:fill="F1F3F5" w:color="auto" w:val="clear"/>
                 <w:rtl/>
               </w:rPr>
-              <w:t xml:space="preserve">‎bankfas-1.0.7-server.tar‎</w:t>
+              <w:t xml:space="preserve">‎bankfas-1.0.8-server.tar‎</w:t>
             </w:r>
           </w:p>
         </w:tc>
@@ -3502,7 +4126,7 @@
                 <w:shd w:fill="F1F3F5" w:color="auto" w:val="clear"/>
                 <w:rtl/>
               </w:rPr>
-              <w:t xml:space="preserve">‎bankfas-1.0.7‎</w:t>
+              <w:t xml:space="preserve">‎bankfas-1.0.8‎</w:t>
             </w:r>
             <w:r>
               <w:rPr>
@@ -3526,7 +4150,7 @@
                 <w:shd w:fill="F1F3F5" w:color="auto" w:val="clear"/>
                 <w:rtl/>
               </w:rPr>
-              <w:t xml:space="preserve">‎bankfas-1.0.7-server.tar.sha256‎</w:t>
+              <w:t xml:space="preserve">‎bankfas-1.0.8-server.tar.sha256‎</w:t>
             </w:r>
           </w:p>
         </w:tc>
@@ -3570,7 +4194,7 @@
                 <w:shd w:fill="F1F3F5" w:color="auto" w:val="clear"/>
                 <w:rtl/>
               </w:rPr>
-              <w:t xml:space="preserve">‎bankfas-images-1.0.7.tar.gz‎</w:t>
+              <w:t xml:space="preserve">‎bankfas-images-1.0.8.tar.gz‎</w:t>
             </w:r>
           </w:p>
         </w:tc>
@@ -3620,7 +4244,7 @@
                 <w:shd w:fill="F1F3F5" w:color="auto" w:val="clear"/>
                 <w:rtl/>
               </w:rPr>
-              <w:t xml:space="preserve">‎bankfas-api:1.0.7‎</w:t>
+              <w:t xml:space="preserve">‎bankfas-api:1.0.8‎</w:t>
             </w:r>
             <w:r>
               <w:rPr>
@@ -3644,7 +4268,7 @@
                 <w:shd w:fill="F1F3F5" w:color="auto" w:val="clear"/>
                 <w:rtl/>
               </w:rPr>
-              <w:t xml:space="preserve">‎bankfas-worker:1.0.7‎</w:t>
+              <w:t xml:space="preserve">‎bankfas-worker:1.0.8‎</w:t>
             </w:r>
             <w:r>
               <w:rPr>
@@ -3698,7 +4322,7 @@
                 <w:shd w:fill="F1F3F5" w:color="auto" w:val="clear"/>
                 <w:rtl/>
               </w:rPr>
-              <w:t xml:space="preserve">‎bankfas-kit-1.0.7.tar.gz‎</w:t>
+              <w:t xml:space="preserve">‎bankfas-kit-1.0.8.tar.gz‎</w:t>
             </w:r>
           </w:p>
         </w:tc>
@@ -3850,7 +4474,7 @@
                 <w:shd w:fill="F1F3F5" w:color="auto" w:val="clear"/>
                 <w:rtl/>
               </w:rPr>
-              <w:t xml:space="preserve">‎bankfas-docs-1.0.7.tar.gz‎</w:t>
+              <w:t xml:space="preserve">‎bankfas-docs-1.0.8.tar.gz‎</w:t>
             </w:r>
           </w:p>
         </w:tc>
@@ -4500,7 +5124,7 @@
           <w:szCs w:val="17"/>
           <w:rtl w:val="false"/>
         </w:rPr>
-        <w:t xml:space="preserve">sha256sum -c bankfas-1.0.7-server.tar.sha256</w:t>
+        <w:t xml:space="preserve">sha256sum -c bankfas-1.0.8-server.tar.sha256</w:t>
       </w:r>
     </w:p>
     <w:p>
@@ -4527,7 +5151,7 @@
           <w:szCs w:val="17"/>
           <w:rtl w:val="false"/>
         </w:rPr>
-        <w:t xml:space="preserve">tar -xf bankfas-1.0.7-server.tar</w:t>
+        <w:t xml:space="preserve">tar -xf bankfas-1.0.8-server.tar</w:t>
       </w:r>
     </w:p>
     <w:p>
@@ -4554,7 +5178,7 @@
           <w:szCs w:val="17"/>
           <w:rtl w:val="false"/>
         </w:rPr>
-        <w:t xml:space="preserve">cd bankfas-1.0.7</w:t>
+        <w:t xml:space="preserve">cd bankfas-1.0.8</w:t>
       </w:r>
     </w:p>
     <w:p>
@@ -4608,7 +5232,7 @@
           <w:szCs w:val="17"/>
           <w:rtl w:val="false"/>
         </w:rPr>
-        <w:t xml:space="preserve">tar -xzf bankfas-kit-1.0.7.tar.gz</w:t>
+        <w:t xml:space="preserve">tar -xzf bankfas-kit-1.0.8.tar.gz</w:t>
       </w:r>
     </w:p>
     <w:p>
@@ -4790,7 +5414,7 @@
           <w:szCs w:val="17"/>
           <w:rtl w:val="false"/>
         </w:rPr>
-        <w:t xml:space="preserve">sudo docker load -i ~/bankfas-1.0.7/bankfas-images-1.0.7.tar.gz</w:t>
+        <w:t xml:space="preserve">sudo docker load -i ~/bankfas-1.0.8/bankfas-images-1.0.8.tar.gz</w:t>
       </w:r>
     </w:p>
     <w:p>
@@ -4817,7 +5441,7 @@
           <w:szCs w:val="17"/>
           <w:rtl w:val="false"/>
         </w:rPr>
-        <w:t xml:space="preserve">sudo docker image ls | grep bankfas    # bankfas-api:1.0.7 و bankfas-worker:1.0.7</w:t>
+        <w:t xml:space="preserve">sudo docker image ls | grep bankfas    # bankfas-api:1.0.8 و bankfas-worker:1.0.8</w:t>
       </w:r>
     </w:p>
     <w:p>
@@ -4882,7 +5506,7 @@
           <w:shd w:fill="F1F3F5" w:color="auto" w:val="clear"/>
           <w:rtl/>
         </w:rPr>
-        <w:t xml:space="preserve">‎bankfas-api:1.0.7‎</w:t>
+        <w:t xml:space="preserve">‎bankfas-api:1.0.8‎</w:t>
       </w:r>
       <w:r>
         <w:rPr>
@@ -4906,7 +5530,7 @@
           <w:shd w:fill="F1F3F5" w:color="auto" w:val="clear"/>
           <w:rtl/>
         </w:rPr>
-        <w:t xml:space="preserve">‎bankfas-worker:1.0.7‎</w:t>
+        <w:t xml:space="preserve">‎bankfas-worker:1.0.8‎</w:t>
       </w:r>
       <w:r>
         <w:rPr>

</xml_diff>